<commit_message>
feat: fuel form — fix header alignment, support 1 or 2 persons per PDF
- Master .docx rebuilt preserving original run structure (imie above label)
- paliwo_master_2.docx: 2-person template with page break + _2 suffix tags
- Radio switch: 1 osoba / 2 osoby — shows/hides second person form
- API accepts list of osoby for multi-person PDF
- Live calculations for both persons independently

Co-Authored-By: Claude Opus 4.6 (1M context) <noreply@anthropic.com>
</commit_message>
<xml_diff>
--- a/mbr/templates/paliwo_master.docx
+++ b/mbr/templates/paliwo_master.docx
@@ -22,57 +22,56 @@
           <w:szCs w:val="24"/>
           <w:lang w:eastAsia="pl-PL"/>
         </w:rPr>
-        <w:t xml:space="preserve">{{imie_nazwisko}} </w:t>
+        <w:t>{{imie_nazwisko}}</w:t>
+      </w:r>
+      <w:r>
+        <w:rPr>
+          <w:rFonts w:ascii="Times New Roman" w:eastAsia="Times New Roman" w:hAnsi="Times New Roman"/>
+          <w:color w:val="0E0E0E"/>
+          <w:sz w:val="24"/>
+          <w:szCs w:val="24"/>
+          <w:lang w:eastAsia="pl-PL"/>
+        </w:rPr>
+      </w:r>
+      <w:r>
+        <w:rPr>
+          <w:rFonts w:ascii="Times New Roman" w:eastAsia="Times New Roman" w:hAnsi="Times New Roman"/>
+          <w:color w:val="0E0E0E"/>
+          <w:sz w:val="24"/>
+          <w:szCs w:val="24"/>
+          <w:lang w:eastAsia="pl-PL"/>
+        </w:rPr>
         <w:tab/>
+      </w:r>
+      <w:r>
+        <w:rPr>
+          <w:rFonts w:ascii="Times New Roman" w:eastAsia="Times New Roman" w:hAnsi="Times New Roman"/>
+          <w:color w:val="0E0E0E"/>
+          <w:sz w:val="24"/>
+          <w:szCs w:val="24"/>
+          <w:lang w:eastAsia="pl-PL"/>
+        </w:rPr>
         <w:tab/>
+      </w:r>
+      <w:r>
+        <w:rPr>
+          <w:rFonts w:ascii="Times New Roman" w:eastAsia="Times New Roman" w:hAnsi="Times New Roman"/>
+          <w:color w:val="0E0E0E"/>
+          <w:sz w:val="24"/>
+          <w:szCs w:val="24"/>
+          <w:lang w:eastAsia="pl-PL"/>
+        </w:rPr>
         <w:tab/>
-        <w:tab/>
+      </w:r>
+      <w:r>
+        <w:rPr>
+          <w:rFonts w:ascii="Times New Roman" w:eastAsia="Times New Roman" w:hAnsi="Times New Roman"/>
+          <w:color w:val="0E0E0E"/>
+          <w:sz w:val="24"/>
+          <w:szCs w:val="24"/>
+          <w:lang w:eastAsia="pl-PL"/>
+        </w:rPr>
         <w:t>{{data_wystawienia}}</w:t>
-      </w:r>
-      <w:r>
-        <w:rPr>
-          <w:rFonts w:ascii="Times New Roman" w:eastAsia="Times New Roman" w:hAnsi="Times New Roman"/>
-          <w:color w:val="0E0E0E"/>
-          <w:sz w:val="24"/>
-          <w:szCs w:val="24"/>
-          <w:lang w:eastAsia="pl-PL"/>
-        </w:rPr>
-      </w:r>
-      <w:r>
-        <w:rPr>
-          <w:rFonts w:ascii="Times New Roman" w:eastAsia="Times New Roman" w:hAnsi="Times New Roman"/>
-          <w:color w:val="0E0E0E"/>
-          <w:sz w:val="24"/>
-          <w:szCs w:val="24"/>
-          <w:lang w:eastAsia="pl-PL"/>
-        </w:rPr>
-      </w:r>
-      <w:r>
-        <w:rPr>
-          <w:rFonts w:ascii="Times New Roman" w:eastAsia="Times New Roman" w:hAnsi="Times New Roman"/>
-          <w:color w:val="0E0E0E"/>
-          <w:sz w:val="24"/>
-          <w:szCs w:val="24"/>
-          <w:lang w:eastAsia="pl-PL"/>
-        </w:rPr>
-      </w:r>
-      <w:r>
-        <w:rPr>
-          <w:rFonts w:ascii="Times New Roman" w:eastAsia="Times New Roman" w:hAnsi="Times New Roman"/>
-          <w:color w:val="0E0E0E"/>
-          <w:sz w:val="24"/>
-          <w:szCs w:val="24"/>
-          <w:lang w:eastAsia="pl-PL"/>
-        </w:rPr>
-      </w:r>
-      <w:r>
-        <w:rPr>
-          <w:rFonts w:ascii="Times New Roman" w:eastAsia="Times New Roman" w:hAnsi="Times New Roman"/>
-          <w:color w:val="0E0E0E"/>
-          <w:sz w:val="24"/>
-          <w:szCs w:val="24"/>
-          <w:lang w:eastAsia="pl-PL"/>
-        </w:rPr>
       </w:r>
     </w:p>
     <w:p>
@@ -290,7 +289,25 @@
           <w:color w:val="0E0E0E"/>
           <w:lang w:eastAsia="pl-PL"/>
         </w:rPr>
-        <w:t xml:space="preserve">o używaniu własnego samochodu nr rej.: </w:t>
+        <w:t xml:space="preserve">o </w:t>
+      </w:r>
+      <w:r>
+        <w:rPr>
+          <w:rFonts w:ascii="Times New Roman" w:eastAsia="Times New Roman" w:hAnsi="Times New Roman"/>
+          <w:b/>
+          <w:color w:val="0E0E0E"/>
+          <w:lang w:eastAsia="pl-PL"/>
+        </w:rPr>
+        <w:t xml:space="preserve">używaniu </w:t>
+      </w:r>
+      <w:r>
+        <w:rPr>
+          <w:rFonts w:ascii="Times New Roman" w:eastAsia="Times New Roman" w:hAnsi="Times New Roman"/>
+          <w:b/>
+          <w:color w:val="0E0E0E"/>
+          <w:lang w:eastAsia="pl-PL"/>
+        </w:rPr>
+        <w:t>własnego samochodu nr rej.:</w:t>
       </w:r>
       <w:r>
         <w:rPr>
@@ -299,23 +316,7 @@
           <w:color w:val="0E0E0E"/>
           <w:lang w:eastAsia="pl-PL"/>
         </w:rPr>
-        <w:t>{{nr_rejestracyjny}}</w:t>
-      </w:r>
-      <w:r>
-        <w:rPr>
-          <w:rFonts w:ascii="Times New Roman" w:eastAsia="Times New Roman" w:hAnsi="Times New Roman"/>
-          <w:b/>
-          <w:color w:val="0E0E0E"/>
-          <w:lang w:eastAsia="pl-PL"/>
-        </w:rPr>
-      </w:r>
-      <w:r>
-        <w:rPr>
-          <w:rFonts w:ascii="Times New Roman" w:eastAsia="Times New Roman" w:hAnsi="Times New Roman"/>
-          <w:b/>
-          <w:color w:val="0E0E0E"/>
-          <w:lang w:eastAsia="pl-PL"/>
-        </w:rPr>
+        <w:t xml:space="preserve"> {{nr_rejestracyjny}}</w:t>
       </w:r>
       <w:r>
         <w:rPr>
@@ -393,6 +394,7 @@
           <w:szCs w:val="24"/>
           <w:lang w:eastAsia="pl-PL"/>
         </w:rPr>
+        <w:t xml:space="preserve">           </w:t>
       </w:r>
       <w:r>
         <w:rPr>
@@ -858,16 +860,16 @@
           <w:szCs w:val="20"/>
           <w:lang w:eastAsia="pl-PL"/>
         </w:rPr>
-      </w:r>
-      <w:r>
-        <w:rPr>
-          <w:rFonts w:ascii="Times New Roman" w:eastAsia="Times New Roman" w:hAnsi="Times New Roman"/>
-          <w:color w:val="0E0E0E"/>
-          <w:sz w:val="20"/>
-          <w:szCs w:val="20"/>
-          <w:lang w:eastAsia="pl-PL"/>
-        </w:rPr>
         <w:t>{{potracenie}} zł</w:t>
+      </w:r>
+      <w:r>
+        <w:rPr>
+          <w:rFonts w:ascii="Times New Roman" w:eastAsia="Times New Roman" w:hAnsi="Times New Roman"/>
+          <w:color w:val="0E0E0E"/>
+          <w:sz w:val="20"/>
+          <w:szCs w:val="20"/>
+          <w:lang w:eastAsia="pl-PL"/>
+        </w:rPr>
       </w:r>
       <w:r>
         <w:rPr>

</xml_diff>

<commit_message>
fix: use user-edited template with table header for centered names
User created paliwo_master_temp.docx with table-based header (centered fields).
Built paliwo_master.docx (1 person) and paliwo_master_2.docx (2 persons with _2 tags).

Co-Authored-By: Claude Opus 4.6 (1M context) <noreply@anthropic.com>
</commit_message>
<xml_diff>
--- a/mbr/templates/paliwo_master.docx
+++ b/mbr/templates/paliwo_master.docx
@@ -4,368 +4,477 @@
   <w:body>
     <w:p>
       <w:pPr>
+        <w:pStyle w:val="Normalny"/>
+        <w:suppressLineNumbers w:val="0"/>
+        <w:bidi w:val="0"/>
+        <w:spacing w:before="0" w:beforeAutospacing="off" w:after="0" w:afterAutospacing="off" w:line="240" w:lineRule="auto"/>
+        <w:ind w:left="0" w:right="0"/>
+        <w:jc w:val="right"/>
+        <w:rPr>
+          <w:rFonts w:ascii="Times New Roman" w:hAnsi="Times New Roman" w:eastAsia="Times New Roman"/>
+          <w:color w:val="0E0E0E"/>
+          <w:sz w:val="24"/>
+          <w:szCs w:val="24"/>
+          <w:lang w:eastAsia="pl-PL"/>
+        </w:rPr>
+      </w:pPr>
+    </w:p>
+    <w:tbl>
+      <w:tblPr>
+        <w:tblStyle w:val="TableGrid"/>
+        <w:tblW w:w="0" w:type="auto"/>
+        <w:tblBorders>
+          <w:top w:val="none" w:color="000000" w:themeColor="text1" w:sz="12"/>
+          <w:left w:val="none" w:color="000000" w:themeColor="text1" w:sz="12"/>
+          <w:bottom w:val="none" w:color="000000" w:themeColor="text1" w:sz="12"/>
+          <w:right w:val="none" w:color="000000" w:themeColor="text1" w:sz="12"/>
+          <w:insideH w:val="none" w:color="000000" w:themeColor="text1" w:sz="12"/>
+          <w:insideV w:val="none" w:color="000000" w:themeColor="text1" w:sz="12"/>
+        </w:tblBorders>
+        <w:tblLook w:val="06A0" w:firstRow="1" w:lastRow="0" w:firstColumn="1" w:lastColumn="0" w:noHBand="1" w:noVBand="1"/>
+      </w:tblPr>
+      <w:tblGrid>
+        <w:gridCol w:w="3600"/>
+        <w:gridCol w:w="3600"/>
+      </w:tblGrid>
+      <w:tr>
+        <w:trPr>
+          <w:trHeight w:val="300"/>
+        </w:trPr>
+        <w:tc>
+          <w:tcPr>
+            <w:tcW w:w="3600" w:type="dxa"/>
+            <w:tcMar/>
+            <w:vAlign w:val="center"/>
+          </w:tcPr>
+          <w:p>
+            <w:pPr>
+              <w:pStyle w:val="Normalny"/>
+              <w:spacing w:after="0" w:afterAutospacing="off"/>
+              <w:jc w:val="center"/>
+              <w:rPr>
+                <w:rFonts w:ascii="Times New Roman" w:hAnsi="Times New Roman" w:eastAsia="Times New Roman"/>
+                <w:color w:val="0E0E0E"/>
+                <w:sz w:val="22"/>
+                <w:szCs w:val="22"/>
+                <w:lang w:eastAsia="pl-PL"/>
+              </w:rPr>
+            </w:pPr>
+            <w:r>
+              <w:rPr>
+                <w:rFonts w:ascii="Times New Roman" w:hAnsi="Times New Roman" w:eastAsia="Times New Roman"/>
+                <w:color w:val="0E0E0E"/>
+                <w:sz w:val="22"/>
+                <w:szCs w:val="22"/>
+                <w:lang w:eastAsia="pl-PL"/>
+              </w:rPr>
+              <w:t>{{</w:t>
+            </w:r>
+            <w:r>
+              <w:rPr>
+                <w:rFonts w:ascii="Times New Roman" w:hAnsi="Times New Roman" w:eastAsia="Times New Roman"/>
+                <w:color w:val="0E0E0E"/>
+                <w:sz w:val="22"/>
+                <w:szCs w:val="22"/>
+                <w:lang w:eastAsia="pl-PL"/>
+              </w:rPr>
+              <w:t>imie_nazwisko</w:t>
+            </w:r>
+            <w:r>
+              <w:rPr>
+                <w:rFonts w:ascii="Times New Roman" w:hAnsi="Times New Roman" w:eastAsia="Times New Roman"/>
+                <w:color w:val="0E0E0E"/>
+                <w:sz w:val="22"/>
+                <w:szCs w:val="22"/>
+                <w:lang w:eastAsia="pl-PL"/>
+              </w:rPr>
+              <w:t>}}</w:t>
+            </w:r>
+          </w:p>
+        </w:tc>
+        <w:tc>
+          <w:tcPr>
+            <w:tcW w:w="3600" w:type="dxa"/>
+            <w:tcMar/>
+            <w:vAlign w:val="center"/>
+          </w:tcPr>
+          <w:p>
+            <w:pPr>
+              <w:pStyle w:val="Normalny"/>
+              <w:spacing w:after="0" w:afterAutospacing="off"/>
+              <w:jc w:val="center"/>
+              <w:rPr>
+                <w:rFonts w:ascii="Times New Roman" w:hAnsi="Times New Roman" w:eastAsia="Times New Roman"/>
+                <w:color w:val="0E0E0E"/>
+                <w:sz w:val="22"/>
+                <w:szCs w:val="22"/>
+                <w:lang w:eastAsia="pl-PL"/>
+              </w:rPr>
+            </w:pPr>
+            <w:r>
+              <w:rPr>
+                <w:rFonts w:ascii="Times New Roman" w:hAnsi="Times New Roman" w:eastAsia="Times New Roman"/>
+                <w:color w:val="0E0E0E"/>
+                <w:sz w:val="22"/>
+                <w:szCs w:val="22"/>
+                <w:lang w:eastAsia="pl-PL"/>
+              </w:rPr>
+              <w:t>{{</w:t>
+            </w:r>
+            <w:r>
+              <w:rPr>
+                <w:rFonts w:ascii="Times New Roman" w:hAnsi="Times New Roman" w:eastAsia="Times New Roman"/>
+                <w:color w:val="0E0E0E"/>
+                <w:sz w:val="22"/>
+                <w:szCs w:val="22"/>
+                <w:lang w:eastAsia="pl-PL"/>
+              </w:rPr>
+              <w:t>data_wystawienia</w:t>
+            </w:r>
+            <w:r>
+              <w:rPr>
+                <w:rFonts w:ascii="Times New Roman" w:hAnsi="Times New Roman" w:eastAsia="Times New Roman"/>
+                <w:color w:val="0E0E0E"/>
+                <w:sz w:val="22"/>
+                <w:szCs w:val="22"/>
+                <w:lang w:eastAsia="pl-PL"/>
+              </w:rPr>
+              <w:t>}}</w:t>
+            </w:r>
+          </w:p>
+        </w:tc>
+      </w:tr>
+      <w:tr>
+        <w:trPr>
+          <w:trHeight w:val="300"/>
+        </w:trPr>
+        <w:tc>
+          <w:tcPr>
+            <w:tcW w:w="3600" w:type="dxa"/>
+            <w:tcMar/>
+            <w:vAlign w:val="center"/>
+          </w:tcPr>
+          <w:p>
+            <w:pPr>
+              <w:pStyle w:val="Normalny"/>
+              <w:spacing w:before="120" w:beforeAutospacing="off"/>
+              <w:jc w:val="center"/>
+              <w:rPr>
+                <w:rFonts w:ascii="Times New Roman" w:hAnsi="Times New Roman" w:eastAsia="Times New Roman"/>
+                <w:color w:val="0E0E0E"/>
+                <w:sz w:val="16"/>
+                <w:szCs w:val="16"/>
+                <w:lang w:eastAsia="pl-PL"/>
+              </w:rPr>
+            </w:pPr>
+            <w:r>
+              <w:rPr>
+                <w:rFonts w:ascii="Times New Roman" w:hAnsi="Times New Roman" w:eastAsia="Times New Roman"/>
+                <w:color w:val="0E0E0E"/>
+                <w:sz w:val="16"/>
+                <w:szCs w:val="16"/>
+                <w:lang w:eastAsia="pl-PL"/>
+              </w:rPr>
+              <w:t>(imię i nazwisko)</w:t>
+            </w:r>
+          </w:p>
+        </w:tc>
+        <w:tc>
+          <w:tcPr>
+            <w:tcW w:w="3600" w:type="dxa"/>
+            <w:tcMar/>
+            <w:vAlign w:val="center"/>
+          </w:tcPr>
+          <w:p>
+            <w:pPr>
+              <w:pStyle w:val="Normalny"/>
+              <w:jc w:val="center"/>
+              <w:rPr>
+                <w:rFonts w:ascii="Times New Roman" w:hAnsi="Times New Roman" w:eastAsia="Times New Roman"/>
+                <w:color w:val="0E0E0E"/>
+                <w:sz w:val="16"/>
+                <w:szCs w:val="16"/>
+                <w:lang w:eastAsia="pl-PL"/>
+              </w:rPr>
+            </w:pPr>
+            <w:r>
+              <w:rPr>
+                <w:rFonts w:ascii="Times New Roman" w:hAnsi="Times New Roman" w:eastAsia="Times New Roman"/>
+                <w:color w:val="0E0E0E"/>
+                <w:sz w:val="16"/>
+                <w:szCs w:val="16"/>
+                <w:lang w:eastAsia="pl-PL"/>
+              </w:rPr>
+              <w:t>(data)</w:t>
+            </w:r>
+          </w:p>
+        </w:tc>
+      </w:tr>
+      <w:tr>
+        <w:trPr>
+          <w:trHeight w:val="435"/>
+        </w:trPr>
+        <w:tc>
+          <w:tcPr>
+            <w:tcW w:w="3600" w:type="dxa"/>
+            <w:tcMar/>
+            <w:vAlign w:val="center"/>
+          </w:tcPr>
+          <w:p>
+            <w:pPr>
+              <w:spacing w:before="0" w:beforeAutospacing="off" w:after="0" w:line="240" w:lineRule="auto"/>
+              <w:jc w:val="center"/>
+              <w:rPr>
+                <w:rFonts w:ascii="Times New Roman" w:hAnsi="Times New Roman" w:eastAsia="Times New Roman"/>
+                <w:color w:val="0E0E0E"/>
+                <w:sz w:val="22"/>
+                <w:szCs w:val="22"/>
+                <w:lang w:eastAsia="pl-PL"/>
+              </w:rPr>
+            </w:pPr>
+            <w:r>
+              <w:rPr>
+                <w:rFonts w:ascii="Times New Roman" w:hAnsi="Times New Roman" w:eastAsia="Times New Roman"/>
+                <w:color w:val="0E0E0E"/>
+                <w:sz w:val="22"/>
+                <w:szCs w:val="22"/>
+                <w:lang w:eastAsia="pl-PL"/>
+              </w:rPr>
+              <w:t>{{stanowisko}}</w:t>
+            </w:r>
+          </w:p>
+        </w:tc>
+        <w:tc>
+          <w:tcPr>
+            <w:tcW w:w="3600" w:type="dxa"/>
+            <w:tcMar/>
+          </w:tcPr>
+          <w:p>
+            <w:pPr>
+              <w:pStyle w:val="Normalny"/>
+              <w:rPr>
+                <w:rFonts w:ascii="Times New Roman" w:hAnsi="Times New Roman" w:eastAsia="Times New Roman"/>
+                <w:color w:val="0E0E0E"/>
+                <w:sz w:val="24"/>
+                <w:szCs w:val="24"/>
+                <w:lang w:eastAsia="pl-PL"/>
+              </w:rPr>
+            </w:pPr>
+          </w:p>
+        </w:tc>
+      </w:tr>
+      <w:tr>
+        <w:trPr>
+          <w:trHeight w:val="300"/>
+        </w:trPr>
+        <w:tc>
+          <w:tcPr>
+            <w:tcW w:w="3600" w:type="dxa"/>
+            <w:tcMar/>
+            <w:vAlign w:val="center"/>
+          </w:tcPr>
+          <w:p>
+            <w:pPr>
+              <w:pStyle w:val="Normalny"/>
+              <w:spacing w:line="240" w:lineRule="auto"/>
+              <w:jc w:val="center"/>
+              <w:rPr>
+                <w:rFonts w:ascii="Times New Roman" w:hAnsi="Times New Roman" w:eastAsia="Times New Roman"/>
+                <w:color w:val="0E0E0E"/>
+                <w:sz w:val="16"/>
+                <w:szCs w:val="16"/>
+                <w:lang w:eastAsia="pl-PL"/>
+              </w:rPr>
+            </w:pPr>
+            <w:r>
+              <w:rPr>
+                <w:rFonts w:ascii="Times New Roman" w:hAnsi="Times New Roman" w:eastAsia="Times New Roman"/>
+                <w:color w:val="0E0E0E"/>
+                <w:sz w:val="16"/>
+                <w:szCs w:val="16"/>
+                <w:lang w:eastAsia="pl-PL"/>
+              </w:rPr>
+              <w:t xml:space="preserve"> (stanowisko służbowe)</w:t>
+            </w:r>
+          </w:p>
+        </w:tc>
+        <w:tc>
+          <w:tcPr>
+            <w:tcW w:w="3600" w:type="dxa"/>
+            <w:tcMar/>
+          </w:tcPr>
+          <w:p>
+            <w:pPr>
+              <w:pStyle w:val="Normalny"/>
+              <w:rPr>
+                <w:rFonts w:ascii="Times New Roman" w:hAnsi="Times New Roman" w:eastAsia="Times New Roman"/>
+                <w:color w:val="0E0E0E"/>
+                <w:sz w:val="24"/>
+                <w:szCs w:val="24"/>
+                <w:lang w:eastAsia="pl-PL"/>
+              </w:rPr>
+            </w:pPr>
+          </w:p>
+        </w:tc>
+      </w:tr>
+    </w:tbl>
+    <w:p>
+      <w:pPr>
         <w:spacing w:after="0" w:line="240" w:lineRule="auto"/>
         <w:jc w:val="right"/>
         <w:rPr>
-          <w:rFonts w:ascii="Times New Roman" w:eastAsia="Times New Roman" w:hAnsi="Times New Roman"/>
+          <w:rFonts w:ascii="Times New Roman" w:hAnsi="Times New Roman" w:eastAsia="Times New Roman"/>
           <w:color w:val="0E0E0E"/>
           <w:sz w:val="24"/>
           <w:szCs w:val="24"/>
           <w:lang w:eastAsia="pl-PL"/>
         </w:rPr>
       </w:pPr>
-      <w:r>
-        <w:rPr>
-          <w:rFonts w:ascii="Times New Roman" w:eastAsia="Times New Roman" w:hAnsi="Times New Roman"/>
+    </w:p>
+    <w:p>
+      <w:pPr>
+        <w:pStyle w:val="Normalny"/>
+        <w:spacing w:after="0" w:line="240" w:lineRule="auto"/>
+        <w:jc w:val="center"/>
+        <w:rPr>
+          <w:rFonts w:ascii="Times New Roman" w:hAnsi="Times New Roman" w:eastAsia="Times New Roman"/>
+          <w:color w:val="0E0E0E"/>
+          <w:sz w:val="32"/>
+          <w:szCs w:val="32"/>
+          <w:lang w:eastAsia="pl-PL"/>
+        </w:rPr>
+      </w:pPr>
+      <w:r>
+        <w:rPr>
+          <w:rFonts w:ascii="Times New Roman" w:hAnsi="Times New Roman" w:eastAsia="Times New Roman"/>
+          <w:b w:val="1"/>
+          <w:bCs w:val="1"/>
+          <w:sz w:val="32"/>
+          <w:szCs w:val="32"/>
+          <w:lang w:eastAsia="pl-PL"/>
+        </w:rPr>
+        <w:t>OŚWIADCZENIE</w:t>
+      </w:r>
+      <w:r>
+        <w:rPr>
+          <w:rFonts w:ascii="Times New Roman" w:hAnsi="Times New Roman" w:eastAsia="Times New Roman"/>
+          <w:b w:val="1"/>
+          <w:bCs w:val="1"/>
+          <w:sz w:val="32"/>
+          <w:szCs w:val="32"/>
+          <w:lang w:eastAsia="pl-PL"/>
+        </w:rPr>
+        <w:t xml:space="preserve"> </w:t>
+      </w:r>
+    </w:p>
+    <w:p>
+      <w:pPr>
+        <w:spacing w:after="0" w:line="240" w:lineRule="auto"/>
+        <w:rPr>
+          <w:rFonts w:ascii="Times New Roman" w:hAnsi="Times New Roman" w:eastAsia="Times New Roman"/>
           <w:color w:val="0E0E0E"/>
           <w:sz w:val="24"/>
           <w:szCs w:val="24"/>
           <w:lang w:eastAsia="pl-PL"/>
         </w:rPr>
-        <w:t>{{imie_nazwisko}}</w:t>
-      </w:r>
-      <w:r>
-        <w:rPr>
-          <w:rFonts w:ascii="Times New Roman" w:eastAsia="Times New Roman" w:hAnsi="Times New Roman"/>
+      </w:pPr>
+    </w:p>
+    <w:p>
+      <w:pPr>
+        <w:spacing w:after="160" w:line="240" w:lineRule="auto"/>
+        <w:jc w:val="right"/>
+        <w:rPr>
+          <w:rFonts w:ascii="Times New Roman" w:hAnsi="Times New Roman" w:eastAsia="Times New Roman"/>
           <w:color w:val="0E0E0E"/>
           <w:sz w:val="24"/>
           <w:szCs w:val="24"/>
           <w:lang w:eastAsia="pl-PL"/>
         </w:rPr>
-      </w:r>
-      <w:r>
-        <w:rPr>
-          <w:rFonts w:ascii="Times New Roman" w:eastAsia="Times New Roman" w:hAnsi="Times New Roman"/>
+      </w:pPr>
+      <w:r>
+        <w:rPr>
+          <w:rFonts w:ascii="Times New Roman" w:hAnsi="Times New Roman" w:eastAsia="Times New Roman"/>
+          <w:b/>
+          <w:color w:val="0E0E0E"/>
+          <w:lang w:eastAsia="pl-PL"/>
+        </w:rPr>
+        <w:t xml:space="preserve">o </w:t>
+      </w:r>
+      <w:r>
+        <w:rPr>
+          <w:rFonts w:ascii="Times New Roman" w:hAnsi="Times New Roman" w:eastAsia="Times New Roman"/>
+          <w:b/>
+          <w:color w:val="0E0E0E"/>
+          <w:lang w:eastAsia="pl-PL"/>
+        </w:rPr>
+        <w:t xml:space="preserve">używaniu </w:t>
+      </w:r>
+      <w:r>
+        <w:rPr>
+          <w:rFonts w:ascii="Times New Roman" w:hAnsi="Times New Roman" w:eastAsia="Times New Roman"/>
+          <w:b/>
+          <w:color w:val="0E0E0E"/>
+          <w:lang w:eastAsia="pl-PL"/>
+        </w:rPr>
+        <w:t>własnego samochodu nr rej.:</w:t>
+      </w:r>
+      <w:r>
+        <w:rPr>
+          <w:rFonts w:ascii="Times New Roman" w:hAnsi="Times New Roman" w:eastAsia="Times New Roman"/>
+          <w:b w:val="0"/>
+          <w:color w:val="0E0E0E"/>
+          <w:lang w:eastAsia="pl-PL"/>
+        </w:rPr>
+        <w:t xml:space="preserve"> {{nr_rejestracyjny}}</w:t>
+      </w:r>
+      <w:r>
+        <w:rPr>
+          <w:rFonts w:ascii="Times New Roman" w:hAnsi="Times New Roman" w:eastAsia="Times New Roman"/>
           <w:color w:val="0E0E0E"/>
           <w:sz w:val="24"/>
           <w:szCs w:val="24"/>
           <w:lang w:eastAsia="pl-PL"/>
         </w:rPr>
-        <w:tab/>
-      </w:r>
-      <w:r>
-        <w:rPr>
-          <w:rFonts w:ascii="Times New Roman" w:eastAsia="Times New Roman" w:hAnsi="Times New Roman"/>
+      </w:r>
+      <w:r>
+        <w:rPr>
+          <w:rFonts w:ascii="Times New Roman" w:hAnsi="Times New Roman" w:eastAsia="Times New Roman"/>
           <w:color w:val="0E0E0E"/>
           <w:sz w:val="24"/>
           <w:szCs w:val="24"/>
           <w:lang w:eastAsia="pl-PL"/>
         </w:rPr>
-        <w:tab/>
-      </w:r>
-      <w:r>
-        <w:rPr>
-          <w:rFonts w:ascii="Times New Roman" w:eastAsia="Times New Roman" w:hAnsi="Times New Roman"/>
+      </w:r>
+      <w:r>
+        <w:rPr>
+          <w:rFonts w:ascii="Times New Roman" w:hAnsi="Times New Roman" w:eastAsia="Times New Roman"/>
           <w:color w:val="0E0E0E"/>
           <w:sz w:val="24"/>
           <w:szCs w:val="24"/>
           <w:lang w:eastAsia="pl-PL"/>
         </w:rPr>
-        <w:tab/>
-      </w:r>
-      <w:r>
-        <w:rPr>
-          <w:rFonts w:ascii="Times New Roman" w:eastAsia="Times New Roman" w:hAnsi="Times New Roman"/>
+      </w:r>
+      <w:r>
+        <w:rPr>
+          <w:rFonts w:ascii="Times New Roman" w:hAnsi="Times New Roman" w:eastAsia="Times New Roman"/>
           <w:color w:val="0E0E0E"/>
           <w:sz w:val="24"/>
           <w:szCs w:val="24"/>
           <w:lang w:eastAsia="pl-PL"/>
         </w:rPr>
-        <w:t>{{data_wystawienia}}</w:t>
-      </w:r>
-    </w:p>
-    <w:p>
-      <w:pPr>
-        <w:spacing w:after="0" w:line="240" w:lineRule="auto"/>
-        <w:rPr>
-          <w:rFonts w:ascii="Times New Roman" w:eastAsia="Times New Roman" w:hAnsi="Times New Roman"/>
-          <w:color w:val="0E0E0E"/>
-          <w:sz w:val="16"/>
-          <w:szCs w:val="16"/>
-          <w:lang w:eastAsia="pl-PL"/>
-        </w:rPr>
-      </w:pPr>
-      <w:r>
-        <w:rPr>
-          <w:rFonts w:ascii="Times New Roman" w:eastAsia="Times New Roman" w:hAnsi="Times New Roman"/>
-          <w:color w:val="0E0E0E"/>
-          <w:sz w:val="16"/>
-          <w:szCs w:val="16"/>
-          <w:lang w:eastAsia="pl-PL"/>
-        </w:rPr>
-        <w:t xml:space="preserve">              </w:t>
-      </w:r>
-      <w:r>
-        <w:rPr>
-          <w:rFonts w:ascii="Times New Roman" w:eastAsia="Times New Roman" w:hAnsi="Times New Roman"/>
-          <w:color w:val="0E0E0E"/>
-          <w:sz w:val="16"/>
-          <w:szCs w:val="16"/>
-          <w:lang w:eastAsia="pl-PL"/>
-        </w:rPr>
-        <w:t>(imię i nazwisko)</w:t>
-      </w:r>
-      <w:r>
-        <w:rPr>
-          <w:rFonts w:ascii="Times New Roman" w:eastAsia="Times New Roman" w:hAnsi="Times New Roman"/>
-          <w:color w:val="0E0E0E"/>
-          <w:sz w:val="16"/>
-          <w:szCs w:val="16"/>
-          <w:lang w:eastAsia="pl-PL"/>
-        </w:rPr>
-        <w:tab/>
-      </w:r>
-      <w:r>
-        <w:rPr>
-          <w:rFonts w:ascii="Times New Roman" w:eastAsia="Times New Roman" w:hAnsi="Times New Roman"/>
-          <w:color w:val="0E0E0E"/>
-          <w:sz w:val="16"/>
-          <w:szCs w:val="16"/>
-          <w:lang w:eastAsia="pl-PL"/>
-        </w:rPr>
-        <w:tab/>
-      </w:r>
-      <w:r>
-        <w:rPr>
-          <w:rFonts w:ascii="Times New Roman" w:eastAsia="Times New Roman" w:hAnsi="Times New Roman"/>
-          <w:color w:val="0E0E0E"/>
-          <w:sz w:val="16"/>
-          <w:szCs w:val="16"/>
-          <w:lang w:eastAsia="pl-PL"/>
-        </w:rPr>
-        <w:tab/>
-      </w:r>
-      <w:r>
-        <w:rPr>
-          <w:rFonts w:ascii="Times New Roman" w:eastAsia="Times New Roman" w:hAnsi="Times New Roman"/>
-          <w:color w:val="0E0E0E"/>
-          <w:sz w:val="16"/>
-          <w:szCs w:val="16"/>
-          <w:lang w:eastAsia="pl-PL"/>
-        </w:rPr>
-        <w:tab/>
-      </w:r>
-      <w:r>
-        <w:rPr>
-          <w:rFonts w:ascii="Times New Roman" w:eastAsia="Times New Roman" w:hAnsi="Times New Roman"/>
-          <w:color w:val="0E0E0E"/>
-          <w:sz w:val="16"/>
-          <w:szCs w:val="16"/>
-          <w:lang w:eastAsia="pl-PL"/>
-        </w:rPr>
-        <w:tab/>
-        <w:t>(data)</w:t>
-      </w:r>
-    </w:p>
-    <w:p>
-      <w:pPr>
-        <w:spacing w:before="240" w:after="0" w:line="240" w:lineRule="auto"/>
-        <w:rPr>
-          <w:rFonts w:ascii="Times New Roman" w:eastAsia="Times New Roman" w:hAnsi="Times New Roman"/>
+      </w:r>
+      <w:r>
+        <w:rPr>
+          <w:rFonts w:ascii="Times New Roman" w:hAnsi="Times New Roman" w:eastAsia="Times New Roman"/>
           <w:color w:val="0E0E0E"/>
           <w:sz w:val="24"/>
           <w:szCs w:val="24"/>
           <w:lang w:eastAsia="pl-PL"/>
         </w:rPr>
-      </w:pPr>
-      <w:r>
-        <w:rPr>
-          <w:rFonts w:ascii="Times New Roman" w:eastAsia="Times New Roman" w:hAnsi="Times New Roman"/>
-          <w:color w:val="0E0E0E"/>
-          <w:sz w:val="24"/>
-          <w:szCs w:val="24"/>
-          <w:lang w:eastAsia="pl-PL"/>
-        </w:rPr>
-        <w:t>{{stanowisko}}</w:t>
-      </w:r>
-    </w:p>
-    <w:p>
-      <w:pPr>
-        <w:spacing w:after="0" w:line="240" w:lineRule="auto"/>
-        <w:rPr>
-          <w:rFonts w:ascii="Times New Roman" w:eastAsia="Times New Roman" w:hAnsi="Times New Roman"/>
-          <w:color w:val="0E0E0E"/>
-          <w:sz w:val="16"/>
-          <w:szCs w:val="16"/>
-          <w:lang w:eastAsia="pl-PL"/>
-        </w:rPr>
-      </w:pPr>
-      <w:r>
-        <w:rPr>
-          <w:rFonts w:ascii="Times New Roman" w:eastAsia="Times New Roman" w:hAnsi="Times New Roman"/>
-          <w:color w:val="0E0E0E"/>
-          <w:sz w:val="16"/>
-          <w:szCs w:val="16"/>
-          <w:lang w:eastAsia="pl-PL"/>
-        </w:rPr>
-        <w:t xml:space="preserve">              (stanowisko służbowe</w:t>
-      </w:r>
-      <w:r>
-        <w:rPr>
-          <w:rFonts w:ascii="Times New Roman" w:eastAsia="Times New Roman" w:hAnsi="Times New Roman"/>
-          <w:color w:val="0E0E0E"/>
-          <w:sz w:val="16"/>
-          <w:szCs w:val="16"/>
-          <w:lang w:eastAsia="pl-PL"/>
-        </w:rPr>
-        <w:t>)</w:t>
-      </w:r>
-    </w:p>
-    <w:p>
-      <w:pPr>
-        <w:spacing w:after="0" w:line="240" w:lineRule="auto"/>
-        <w:rPr>
-          <w:rFonts w:ascii="Times New Roman" w:eastAsia="Times New Roman" w:hAnsi="Times New Roman"/>
-          <w:color w:val="0E0E0E"/>
-          <w:sz w:val="24"/>
-          <w:szCs w:val="24"/>
-          <w:lang w:eastAsia="pl-PL"/>
-        </w:rPr>
-      </w:pPr>
-    </w:p>
-    <w:p>
-      <w:pPr>
-        <w:spacing w:after="0" w:line="240" w:lineRule="auto"/>
-        <w:jc w:val="center"/>
-        <w:rPr>
-          <w:rFonts w:ascii="Times New Roman" w:eastAsia="Times New Roman" w:hAnsi="Times New Roman"/>
-          <w:color w:val="0E0E0E"/>
-          <w:sz w:val="32"/>
-          <w:szCs w:val="32"/>
-          <w:lang w:eastAsia="pl-PL"/>
-        </w:rPr>
-      </w:pPr>
-      <w:r>
-        <w:rPr>
-          <w:rFonts w:ascii="Times New Roman" w:eastAsia="Times New Roman" w:hAnsi="Times New Roman"/>
-          <w:b/>
-          <w:bCs/>
-          <w:sz w:val="32"/>
-          <w:szCs w:val="32"/>
-          <w:lang w:eastAsia="pl-PL"/>
-        </w:rPr>
-        <w:t>OŚWIADCZENIE</w:t>
-      </w:r>
-      <w:r>
-        <w:rPr>
-          <w:rFonts w:ascii="Times New Roman" w:eastAsia="Times New Roman" w:hAnsi="Times New Roman"/>
-          <w:b/>
-          <w:bCs/>
-          <w:sz w:val="32"/>
-          <w:szCs w:val="32"/>
-          <w:lang w:eastAsia="pl-PL"/>
-        </w:rPr>
-        <w:t xml:space="preserve"> </w:t>
-      </w:r>
-    </w:p>
-    <w:p>
-      <w:pPr>
-        <w:spacing w:after="0" w:line="240" w:lineRule="auto"/>
-        <w:rPr>
-          <w:rFonts w:ascii="Times New Roman" w:eastAsia="Times New Roman" w:hAnsi="Times New Roman"/>
-          <w:color w:val="0E0E0E"/>
-          <w:sz w:val="24"/>
-          <w:szCs w:val="24"/>
-          <w:lang w:eastAsia="pl-PL"/>
-        </w:rPr>
-      </w:pPr>
-    </w:p>
-    <w:p>
-      <w:pPr>
-        <w:spacing w:after="160" w:line="240" w:lineRule="auto"/>
-        <w:jc w:val="right"/>
-        <w:rPr>
-          <w:rFonts w:ascii="Times New Roman" w:eastAsia="Times New Roman" w:hAnsi="Times New Roman"/>
-          <w:color w:val="0E0E0E"/>
-          <w:sz w:val="24"/>
-          <w:szCs w:val="24"/>
-          <w:lang w:eastAsia="pl-PL"/>
-        </w:rPr>
-      </w:pPr>
-      <w:r>
-        <w:rPr>
-          <w:rFonts w:ascii="Times New Roman" w:eastAsia="Times New Roman" w:hAnsi="Times New Roman"/>
-          <w:b/>
-          <w:color w:val="0E0E0E"/>
-          <w:lang w:eastAsia="pl-PL"/>
-        </w:rPr>
-        <w:t xml:space="preserve">o </w:t>
-      </w:r>
-      <w:r>
-        <w:rPr>
-          <w:rFonts w:ascii="Times New Roman" w:eastAsia="Times New Roman" w:hAnsi="Times New Roman"/>
-          <w:b/>
-          <w:color w:val="0E0E0E"/>
-          <w:lang w:eastAsia="pl-PL"/>
-        </w:rPr>
-        <w:t xml:space="preserve">używaniu </w:t>
-      </w:r>
-      <w:r>
-        <w:rPr>
-          <w:rFonts w:ascii="Times New Roman" w:eastAsia="Times New Roman" w:hAnsi="Times New Roman"/>
-          <w:b/>
-          <w:color w:val="0E0E0E"/>
-          <w:lang w:eastAsia="pl-PL"/>
-        </w:rPr>
-        <w:t>własnego samochodu nr rej.:</w:t>
-      </w:r>
-      <w:r>
-        <w:rPr>
-          <w:rFonts w:ascii="Times New Roman" w:eastAsia="Times New Roman" w:hAnsi="Times New Roman"/>
-          <w:b w:val="0"/>
-          <w:color w:val="0E0E0E"/>
-          <w:lang w:eastAsia="pl-PL"/>
-        </w:rPr>
-        <w:t xml:space="preserve"> {{nr_rejestracyjny}}</w:t>
-      </w:r>
-      <w:r>
-        <w:rPr>
-          <w:rFonts w:ascii="Times New Roman" w:eastAsia="Times New Roman" w:hAnsi="Times New Roman"/>
-          <w:color w:val="0E0E0E"/>
-          <w:sz w:val="24"/>
-          <w:szCs w:val="24"/>
-          <w:lang w:eastAsia="pl-PL"/>
-        </w:rPr>
-      </w:r>
-      <w:r>
-        <w:rPr>
-          <w:rFonts w:ascii="Times New Roman" w:eastAsia="Times New Roman" w:hAnsi="Times New Roman"/>
-          <w:color w:val="0E0E0E"/>
-          <w:sz w:val="24"/>
-          <w:szCs w:val="24"/>
-          <w:lang w:eastAsia="pl-PL"/>
-        </w:rPr>
-      </w:r>
-      <w:r>
-        <w:rPr>
-          <w:rFonts w:ascii="Times New Roman" w:eastAsia="Times New Roman" w:hAnsi="Times New Roman"/>
-          <w:color w:val="0E0E0E"/>
-          <w:sz w:val="24"/>
-          <w:szCs w:val="24"/>
-          <w:lang w:eastAsia="pl-PL"/>
-        </w:rPr>
-      </w:r>
-      <w:r>
-        <w:rPr>
-          <w:rFonts w:ascii="Times New Roman" w:eastAsia="Times New Roman" w:hAnsi="Times New Roman"/>
-          <w:color w:val="0E0E0E"/>
-          <w:sz w:val="24"/>
-          <w:szCs w:val="24"/>
-          <w:lang w:eastAsia="pl-PL"/>
-        </w:rPr>
-      </w:r>
-      <w:r>
-        <w:rPr>
-          <w:rFonts w:ascii="Times New Roman" w:eastAsia="Times New Roman" w:hAnsi="Times New Roman"/>
-          <w:color w:val="0E0E0E"/>
-          <w:sz w:val="24"/>
-          <w:szCs w:val="24"/>
-          <w:lang w:eastAsia="pl-PL"/>
-        </w:rPr>
-      </w:r>
-      <w:r>
-        <w:rPr>
-          <w:rFonts w:ascii="Times New Roman" w:eastAsia="Times New Roman" w:hAnsi="Times New Roman"/>
+      </w:r>
+      <w:r>
+        <w:rPr>
+          <w:rFonts w:ascii="Times New Roman" w:hAnsi="Times New Roman" w:eastAsia="Times New Roman"/>
           <w:color w:val="0E0E0E"/>
           <w:sz w:val="24"/>
           <w:szCs w:val="24"/>
@@ -379,7 +488,7 @@
         <w:ind w:left="2126"/>
         <w:jc w:val="right"/>
         <w:rPr>
-          <w:rFonts w:ascii="Times New Roman" w:eastAsia="Times New Roman" w:hAnsi="Times New Roman"/>
+          <w:rFonts w:ascii="Times New Roman" w:hAnsi="Times New Roman" w:eastAsia="Times New Roman"/>
           <w:color w:val="0E0E0E"/>
           <w:sz w:val="24"/>
           <w:szCs w:val="24"/>
@@ -388,7 +497,7 @@
       </w:pPr>
       <w:r>
         <w:rPr>
-          <w:rFonts w:ascii="Times New Roman" w:eastAsia="Times New Roman" w:hAnsi="Times New Roman"/>
+          <w:rFonts w:ascii="Times New Roman" w:hAnsi="Times New Roman" w:eastAsia="Times New Roman"/>
           <w:color w:val="0E0E0E"/>
           <w:sz w:val="24"/>
           <w:szCs w:val="24"/>
@@ -398,7 +507,7 @@
       </w:r>
       <w:r>
         <w:rPr>
-          <w:rFonts w:ascii="Times New Roman" w:eastAsia="Times New Roman" w:hAnsi="Times New Roman"/>
+          <w:rFonts w:ascii="Times New Roman" w:hAnsi="Times New Roman" w:eastAsia="Times New Roman"/>
           <w:b/>
           <w:color w:val="0E0E0E"/>
           <w:lang w:eastAsia="pl-PL"/>
@@ -407,7 +516,7 @@
       </w:r>
       <w:r>
         <w:rPr>
-          <w:rFonts w:ascii="Times New Roman" w:eastAsia="Times New Roman" w:hAnsi="Times New Roman"/>
+          <w:rFonts w:ascii="Times New Roman" w:hAnsi="Times New Roman" w:eastAsia="Times New Roman"/>
           <w:color w:val="0E0E0E"/>
           <w:sz w:val="24"/>
           <w:szCs w:val="24"/>
@@ -417,7 +526,7 @@
       </w:r>
       <w:r>
         <w:rPr>
-          <w:rFonts w:ascii="Times New Roman" w:eastAsia="Times New Roman" w:hAnsi="Times New Roman"/>
+          <w:rFonts w:ascii="Times New Roman" w:hAnsi="Times New Roman" w:eastAsia="Times New Roman"/>
           <w:color w:val="0E0E0E"/>
           <w:sz w:val="24"/>
           <w:szCs w:val="24"/>
@@ -426,7 +535,7 @@
       </w:r>
       <w:r>
         <w:rPr>
-          <w:rFonts w:ascii="Times New Roman" w:eastAsia="Times New Roman" w:hAnsi="Times New Roman"/>
+          <w:rFonts w:ascii="Times New Roman" w:hAnsi="Times New Roman" w:eastAsia="Times New Roman"/>
           <w:color w:val="0E0E0E"/>
           <w:sz w:val="24"/>
           <w:szCs w:val="24"/>
@@ -435,7 +544,7 @@
       </w:r>
       <w:r>
         <w:rPr>
-          <w:rFonts w:ascii="Times New Roman" w:eastAsia="Times New Roman" w:hAnsi="Times New Roman"/>
+          <w:rFonts w:ascii="Times New Roman" w:hAnsi="Times New Roman" w:eastAsia="Times New Roman"/>
           <w:color w:val="0E0E0E"/>
           <w:sz w:val="24"/>
           <w:szCs w:val="24"/>
@@ -444,7 +553,7 @@
       </w:r>
       <w:r>
         <w:rPr>
-          <w:rFonts w:ascii="Times New Roman" w:eastAsia="Times New Roman" w:hAnsi="Times New Roman"/>
+          <w:rFonts w:ascii="Times New Roman" w:hAnsi="Times New Roman" w:eastAsia="Times New Roman"/>
           <w:color w:val="0E0E0E"/>
           <w:sz w:val="24"/>
           <w:szCs w:val="24"/>
@@ -458,7 +567,7 @@
         <w:ind w:left="2124"/>
         <w:jc w:val="right"/>
         <w:rPr>
-          <w:rFonts w:ascii="Times New Roman" w:eastAsia="Times New Roman" w:hAnsi="Times New Roman"/>
+          <w:rFonts w:ascii="Times New Roman" w:hAnsi="Times New Roman" w:eastAsia="Times New Roman"/>
           <w:color w:val="0E0E0E"/>
           <w:sz w:val="24"/>
           <w:szCs w:val="24"/>
@@ -472,16 +581,16 @@
         <w:ind w:firstLine="284"/>
         <w:jc w:val="right"/>
         <w:rPr>
-          <w:rFonts w:ascii="Times New Roman" w:eastAsia="Times New Roman" w:hAnsi="Times New Roman"/>
-          <w:color w:val="0E0E0E"/>
-          <w:sz w:val="20"/>
-          <w:szCs w:val="20"/>
-          <w:lang w:eastAsia="pl-PL"/>
-        </w:rPr>
-      </w:pPr>
-      <w:r>
-        <w:rPr>
-          <w:rFonts w:ascii="Times New Roman" w:eastAsia="Times New Roman" w:hAnsi="Times New Roman"/>
+          <w:rFonts w:ascii="Times New Roman" w:hAnsi="Times New Roman" w:eastAsia="Times New Roman"/>
+          <w:color w:val="0E0E0E"/>
+          <w:sz w:val="20"/>
+          <w:szCs w:val="20"/>
+          <w:lang w:eastAsia="pl-PL"/>
+        </w:rPr>
+      </w:pPr>
+      <w:r>
+        <w:rPr>
+          <w:rFonts w:ascii="Times New Roman" w:hAnsi="Times New Roman" w:eastAsia="Times New Roman"/>
           <w:color w:val="0E0E0E"/>
           <w:sz w:val="20"/>
           <w:szCs w:val="20"/>
@@ -491,52 +600,52 @@
       </w:r>
       <w:r>
         <w:rPr>
-          <w:rFonts w:ascii="Times New Roman" w:eastAsia="Times New Roman" w:hAnsi="Times New Roman"/>
-          <w:color w:val="0E0E0E"/>
-          <w:sz w:val="20"/>
-          <w:szCs w:val="20"/>
-          <w:lang w:eastAsia="pl-PL"/>
-        </w:rPr>
-      </w:r>
-      <w:r>
-        <w:rPr>
-          <w:rFonts w:ascii="Times New Roman" w:eastAsia="Times New Roman" w:hAnsi="Times New Roman"/>
-          <w:color w:val="0E0E0E"/>
-          <w:sz w:val="20"/>
-          <w:szCs w:val="20"/>
-          <w:lang w:eastAsia="pl-PL"/>
-        </w:rPr>
-      </w:r>
-      <w:r>
-        <w:rPr>
-          <w:rFonts w:ascii="Times New Roman" w:eastAsia="Times New Roman" w:hAnsi="Times New Roman"/>
-          <w:color w:val="0E0E0E"/>
-          <w:sz w:val="20"/>
-          <w:szCs w:val="20"/>
-          <w:lang w:eastAsia="pl-PL"/>
-        </w:rPr>
-      </w:r>
-      <w:r>
-        <w:rPr>
-          <w:rFonts w:ascii="Times New Roman" w:eastAsia="Times New Roman" w:hAnsi="Times New Roman"/>
-          <w:color w:val="0E0E0E"/>
-          <w:sz w:val="20"/>
-          <w:szCs w:val="20"/>
-          <w:lang w:eastAsia="pl-PL"/>
-        </w:rPr>
-      </w:r>
-      <w:r>
-        <w:rPr>
-          <w:rFonts w:ascii="Times New Roman" w:eastAsia="Times New Roman" w:hAnsi="Times New Roman"/>
-          <w:color w:val="0E0E0E"/>
-          <w:sz w:val="20"/>
-          <w:szCs w:val="20"/>
-          <w:lang w:eastAsia="pl-PL"/>
-        </w:rPr>
-      </w:r>
-      <w:r>
-        <w:rPr>
-          <w:rFonts w:ascii="Times New Roman" w:eastAsia="Times New Roman" w:hAnsi="Times New Roman"/>
+          <w:rFonts w:ascii="Times New Roman" w:hAnsi="Times New Roman" w:eastAsia="Times New Roman"/>
+          <w:color w:val="0E0E0E"/>
+          <w:sz w:val="20"/>
+          <w:szCs w:val="20"/>
+          <w:lang w:eastAsia="pl-PL"/>
+        </w:rPr>
+      </w:r>
+      <w:r>
+        <w:rPr>
+          <w:rFonts w:ascii="Times New Roman" w:hAnsi="Times New Roman" w:eastAsia="Times New Roman"/>
+          <w:color w:val="0E0E0E"/>
+          <w:sz w:val="20"/>
+          <w:szCs w:val="20"/>
+          <w:lang w:eastAsia="pl-PL"/>
+        </w:rPr>
+      </w:r>
+      <w:r>
+        <w:rPr>
+          <w:rFonts w:ascii="Times New Roman" w:hAnsi="Times New Roman" w:eastAsia="Times New Roman"/>
+          <w:color w:val="0E0E0E"/>
+          <w:sz w:val="20"/>
+          <w:szCs w:val="20"/>
+          <w:lang w:eastAsia="pl-PL"/>
+        </w:rPr>
+      </w:r>
+      <w:r>
+        <w:rPr>
+          <w:rFonts w:ascii="Times New Roman" w:hAnsi="Times New Roman" w:eastAsia="Times New Roman"/>
+          <w:color w:val="0E0E0E"/>
+          <w:sz w:val="20"/>
+          <w:szCs w:val="20"/>
+          <w:lang w:eastAsia="pl-PL"/>
+        </w:rPr>
+      </w:r>
+      <w:r>
+        <w:rPr>
+          <w:rFonts w:ascii="Times New Roman" w:hAnsi="Times New Roman" w:eastAsia="Times New Roman"/>
+          <w:color w:val="0E0E0E"/>
+          <w:sz w:val="20"/>
+          <w:szCs w:val="20"/>
+          <w:lang w:eastAsia="pl-PL"/>
+        </w:rPr>
+      </w:r>
+      <w:r>
+        <w:rPr>
+          <w:rFonts w:ascii="Times New Roman" w:hAnsi="Times New Roman" w:eastAsia="Times New Roman"/>
           <w:color w:val="0E0E0E"/>
           <w:sz w:val="20"/>
           <w:szCs w:val="20"/>
@@ -548,16 +657,16 @@
       <w:pPr>
         <w:spacing w:after="0" w:line="240" w:lineRule="auto"/>
         <w:rPr>
-          <w:rFonts w:ascii="Times New Roman" w:eastAsia="Times New Roman" w:hAnsi="Times New Roman"/>
-          <w:color w:val="0E0E0E"/>
-          <w:sz w:val="20"/>
-          <w:szCs w:val="20"/>
-          <w:lang w:eastAsia="pl-PL"/>
-        </w:rPr>
-      </w:pPr>
-      <w:r>
-        <w:rPr>
-          <w:rFonts w:ascii="Times New Roman" w:eastAsia="Times New Roman" w:hAnsi="Times New Roman"/>
+          <w:rFonts w:ascii="Times New Roman" w:hAnsi="Times New Roman" w:eastAsia="Times New Roman"/>
+          <w:color w:val="0E0E0E"/>
+          <w:sz w:val="20"/>
+          <w:szCs w:val="20"/>
+          <w:lang w:eastAsia="pl-PL"/>
+        </w:rPr>
+      </w:pPr>
+      <w:r>
+        <w:rPr>
+          <w:rFonts w:ascii="Times New Roman" w:hAnsi="Times New Roman" w:eastAsia="Times New Roman"/>
           <w:color w:val="0E0E0E"/>
           <w:sz w:val="20"/>
           <w:szCs w:val="20"/>
@@ -567,79 +676,79 @@
       </w:r>
       <w:r>
         <w:rPr>
-          <w:rFonts w:ascii="Times New Roman" w:eastAsia="Times New Roman" w:hAnsi="Times New Roman"/>
-          <w:color w:val="0E0E0E"/>
-          <w:sz w:val="20"/>
-          <w:szCs w:val="20"/>
-          <w:lang w:eastAsia="pl-PL"/>
-        </w:rPr>
-      </w:r>
-      <w:r>
-        <w:rPr>
-          <w:rFonts w:ascii="Times New Roman" w:eastAsia="Times New Roman" w:hAnsi="Times New Roman"/>
-          <w:color w:val="0E0E0E"/>
-          <w:sz w:val="20"/>
-          <w:szCs w:val="20"/>
-          <w:lang w:eastAsia="pl-PL"/>
-        </w:rPr>
-      </w:r>
-      <w:r>
-        <w:rPr>
-          <w:rFonts w:ascii="Times New Roman" w:eastAsia="Times New Roman" w:hAnsi="Times New Roman"/>
-          <w:color w:val="0E0E0E"/>
-          <w:sz w:val="20"/>
-          <w:szCs w:val="20"/>
-          <w:lang w:eastAsia="pl-PL"/>
-        </w:rPr>
-      </w:r>
-      <w:r>
-        <w:rPr>
-          <w:rFonts w:ascii="Times New Roman" w:eastAsia="Times New Roman" w:hAnsi="Times New Roman"/>
-          <w:color w:val="0E0E0E"/>
-          <w:sz w:val="20"/>
-          <w:szCs w:val="20"/>
-          <w:lang w:eastAsia="pl-PL"/>
-        </w:rPr>
-      </w:r>
-      <w:r>
-        <w:rPr>
-          <w:rFonts w:ascii="Times New Roman" w:eastAsia="Times New Roman" w:hAnsi="Times New Roman"/>
-          <w:color w:val="0E0E0E"/>
-          <w:sz w:val="20"/>
-          <w:szCs w:val="20"/>
-          <w:lang w:eastAsia="pl-PL"/>
-        </w:rPr>
-      </w:r>
-      <w:r>
-        <w:rPr>
-          <w:rFonts w:ascii="Times New Roman" w:eastAsia="Times New Roman" w:hAnsi="Times New Roman"/>
-          <w:color w:val="0E0E0E"/>
-          <w:sz w:val="20"/>
-          <w:szCs w:val="20"/>
-          <w:lang w:eastAsia="pl-PL"/>
-        </w:rPr>
-      </w:r>
-      <w:r>
-        <w:rPr>
-          <w:rFonts w:ascii="Times New Roman" w:eastAsia="Times New Roman" w:hAnsi="Times New Roman"/>
-          <w:color w:val="0E0E0E"/>
-          <w:sz w:val="20"/>
-          <w:szCs w:val="20"/>
-          <w:lang w:eastAsia="pl-PL"/>
-        </w:rPr>
-      </w:r>
-      <w:r>
-        <w:rPr>
-          <w:rFonts w:ascii="Times New Roman" w:eastAsia="Times New Roman" w:hAnsi="Times New Roman"/>
-          <w:color w:val="0E0E0E"/>
-          <w:sz w:val="20"/>
-          <w:szCs w:val="20"/>
-          <w:lang w:eastAsia="pl-PL"/>
-        </w:rPr>
-      </w:r>
-      <w:r>
-        <w:rPr>
-          <w:rFonts w:ascii="Times New Roman" w:eastAsia="Times New Roman" w:hAnsi="Times New Roman"/>
+          <w:rFonts w:ascii="Times New Roman" w:hAnsi="Times New Roman" w:eastAsia="Times New Roman"/>
+          <w:color w:val="0E0E0E"/>
+          <w:sz w:val="20"/>
+          <w:szCs w:val="20"/>
+          <w:lang w:eastAsia="pl-PL"/>
+        </w:rPr>
+      </w:r>
+      <w:r>
+        <w:rPr>
+          <w:rFonts w:ascii="Times New Roman" w:hAnsi="Times New Roman" w:eastAsia="Times New Roman"/>
+          <w:color w:val="0E0E0E"/>
+          <w:sz w:val="20"/>
+          <w:szCs w:val="20"/>
+          <w:lang w:eastAsia="pl-PL"/>
+        </w:rPr>
+      </w:r>
+      <w:r>
+        <w:rPr>
+          <w:rFonts w:ascii="Times New Roman" w:hAnsi="Times New Roman" w:eastAsia="Times New Roman"/>
+          <w:color w:val="0E0E0E"/>
+          <w:sz w:val="20"/>
+          <w:szCs w:val="20"/>
+          <w:lang w:eastAsia="pl-PL"/>
+        </w:rPr>
+      </w:r>
+      <w:r>
+        <w:rPr>
+          <w:rFonts w:ascii="Times New Roman" w:hAnsi="Times New Roman" w:eastAsia="Times New Roman"/>
+          <w:color w:val="0E0E0E"/>
+          <w:sz w:val="20"/>
+          <w:szCs w:val="20"/>
+          <w:lang w:eastAsia="pl-PL"/>
+        </w:rPr>
+      </w:r>
+      <w:r>
+        <w:rPr>
+          <w:rFonts w:ascii="Times New Roman" w:hAnsi="Times New Roman" w:eastAsia="Times New Roman"/>
+          <w:color w:val="0E0E0E"/>
+          <w:sz w:val="20"/>
+          <w:szCs w:val="20"/>
+          <w:lang w:eastAsia="pl-PL"/>
+        </w:rPr>
+      </w:r>
+      <w:r>
+        <w:rPr>
+          <w:rFonts w:ascii="Times New Roman" w:hAnsi="Times New Roman" w:eastAsia="Times New Roman"/>
+          <w:color w:val="0E0E0E"/>
+          <w:sz w:val="20"/>
+          <w:szCs w:val="20"/>
+          <w:lang w:eastAsia="pl-PL"/>
+        </w:rPr>
+      </w:r>
+      <w:r>
+        <w:rPr>
+          <w:rFonts w:ascii="Times New Roman" w:hAnsi="Times New Roman" w:eastAsia="Times New Roman"/>
+          <w:color w:val="0E0E0E"/>
+          <w:sz w:val="20"/>
+          <w:szCs w:val="20"/>
+          <w:lang w:eastAsia="pl-PL"/>
+        </w:rPr>
+      </w:r>
+      <w:r>
+        <w:rPr>
+          <w:rFonts w:ascii="Times New Roman" w:hAnsi="Times New Roman" w:eastAsia="Times New Roman"/>
+          <w:color w:val="0E0E0E"/>
+          <w:sz w:val="20"/>
+          <w:szCs w:val="20"/>
+          <w:lang w:eastAsia="pl-PL"/>
+        </w:rPr>
+      </w:r>
+      <w:r>
+        <w:rPr>
+          <w:rFonts w:ascii="Times New Roman" w:hAnsi="Times New Roman" w:eastAsia="Times New Roman"/>
           <w:color w:val="0E0E0E"/>
           <w:sz w:val="20"/>
           <w:szCs w:val="20"/>
@@ -653,17 +762,17 @@
         <w:ind w:left="1416" w:firstLine="708"/>
         <w:jc w:val="right"/>
         <w:rPr>
-          <w:rFonts w:ascii="Times New Roman" w:eastAsia="Times New Roman" w:hAnsi="Times New Roman"/>
+          <w:rFonts w:ascii="Times New Roman" w:hAnsi="Times New Roman" w:eastAsia="Times New Roman"/>
           <w:color w:val="0E0E0E"/>
           <w:sz w:val="24"/>
           <w:szCs w:val="24"/>
           <w:lang w:eastAsia="pl-PL"/>
         </w:rPr>
       </w:pPr>
-      <w:bookmarkStart w:id="0" w:name="_Hlk166702508"/>
-      <w:r>
-        <w:rPr>
-          <w:rFonts w:ascii="Times New Roman" w:eastAsia="Times New Roman" w:hAnsi="Times New Roman"/>
+      <w:bookmarkStart w:name="_Hlk166702508" w:id="0"/>
+      <w:r>
+        <w:rPr>
+          <w:rFonts w:ascii="Times New Roman" w:hAnsi="Times New Roman" w:eastAsia="Times New Roman"/>
           <w:color w:val="0E0E0E"/>
           <w:sz w:val="20"/>
           <w:szCs w:val="20"/>
@@ -673,16 +782,16 @@
       </w:r>
       <w:r>
         <w:rPr>
-          <w:rFonts w:ascii="Times New Roman" w:eastAsia="Times New Roman" w:hAnsi="Times New Roman"/>
-          <w:color w:val="0E0E0E"/>
-          <w:sz w:val="20"/>
-          <w:szCs w:val="20"/>
-          <w:lang w:eastAsia="pl-PL"/>
-        </w:rPr>
-      </w:r>
-      <w:r>
-        <w:rPr>
-          <w:rFonts w:ascii="Times New Roman" w:eastAsia="Times New Roman" w:hAnsi="Times New Roman"/>
+          <w:rFonts w:ascii="Times New Roman" w:hAnsi="Times New Roman" w:eastAsia="Times New Roman"/>
+          <w:color w:val="0E0E0E"/>
+          <w:sz w:val="20"/>
+          <w:szCs w:val="20"/>
+          <w:lang w:eastAsia="pl-PL"/>
+        </w:rPr>
+      </w:r>
+      <w:r>
+        <w:rPr>
+          <w:rFonts w:ascii="Times New Roman" w:hAnsi="Times New Roman" w:eastAsia="Times New Roman"/>
           <w:color w:val="0E0E0E"/>
           <w:sz w:val="20"/>
           <w:szCs w:val="20"/>
@@ -695,7 +804,7 @@
       <w:pPr>
         <w:spacing w:before="240" w:after="240" w:line="240" w:lineRule="auto"/>
         <w:rPr>
-          <w:rFonts w:ascii="Times New Roman" w:eastAsia="Times New Roman" w:hAnsi="Times New Roman"/>
+          <w:rFonts w:ascii="Times New Roman" w:hAnsi="Times New Roman" w:eastAsia="Times New Roman"/>
           <w:b/>
           <w:color w:val="0E0E0E"/>
           <w:sz w:val="24"/>
@@ -705,7 +814,7 @@
       </w:pPr>
       <w:r>
         <w:rPr>
-          <w:rFonts w:ascii="Times New Roman" w:eastAsia="Times New Roman" w:hAnsi="Times New Roman"/>
+          <w:rFonts w:ascii="Times New Roman" w:hAnsi="Times New Roman" w:eastAsia="Times New Roman"/>
           <w:b/>
           <w:color w:val="0E0E0E"/>
           <w:sz w:val="24"/>
@@ -719,7 +828,7 @@
       <w:pPr>
         <w:spacing w:after="120" w:line="240" w:lineRule="auto"/>
         <w:rPr>
-          <w:rFonts w:ascii="Times New Roman" w:eastAsia="Times New Roman" w:hAnsi="Times New Roman"/>
+          <w:rFonts w:ascii="Times New Roman" w:hAnsi="Times New Roman" w:eastAsia="Times New Roman"/>
           <w:color w:val="0E0E0E"/>
           <w:sz w:val="18"/>
           <w:szCs w:val="18"/>
@@ -728,28 +837,46 @@
       </w:pPr>
       <w:r>
         <w:rPr>
-          <w:rFonts w:ascii="Times New Roman" w:eastAsia="Times New Roman" w:hAnsi="Times New Roman"/>
+          <w:rFonts w:ascii="Times New Roman" w:hAnsi="Times New Roman" w:eastAsia="Times New Roman"/>
           <w:color w:val="0E0E0E"/>
           <w:sz w:val="18"/>
           <w:szCs w:val="18"/>
           <w:lang w:eastAsia="pl-PL"/>
         </w:rPr>
         <w:t>Za {{dni_urlopu}} dni urlopu wypoczynkowego (okolicznościowego,</w:t>
-        <w:br/>
-        <w:t>bezpłatnego), delegacji służbowej, z powodu choroby.</w:t>
-      </w:r>
-      <w:r>
-        <w:rPr>
-          <w:rFonts w:ascii="Times New Roman" w:eastAsia="Times New Roman" w:hAnsi="Times New Roman"/>
+      </w:r>
+      <w:r>
+        <w:rPr>
+          <w:rFonts w:ascii="Times New Roman" w:hAnsi="Times New Roman" w:eastAsia="Times New Roman"/>
           <w:color w:val="0E0E0E"/>
           <w:sz w:val="18"/>
           <w:szCs w:val="18"/>
           <w:lang w:eastAsia="pl-PL"/>
         </w:rPr>
-      </w:r>
-      <w:r>
-        <w:rPr>
-          <w:rFonts w:ascii="Times New Roman" w:eastAsia="Times New Roman" w:hAnsi="Times New Roman"/>
+        <w:br/>
+      </w:r>
+      <w:r>
+        <w:rPr>
+          <w:rFonts w:ascii="Times New Roman" w:hAnsi="Times New Roman" w:eastAsia="Times New Roman"/>
+          <w:color w:val="0E0E0E"/>
+          <w:sz w:val="18"/>
+          <w:szCs w:val="18"/>
+          <w:lang w:eastAsia="pl-PL"/>
+        </w:rPr>
+        <w:t>bezpłatnego), delegacji służbowej, z powodu choroby.</w:t>
+      </w:r>
+      <w:r>
+        <w:rPr>
+          <w:rFonts w:ascii="Times New Roman" w:hAnsi="Times New Roman" w:eastAsia="Times New Roman"/>
+          <w:color w:val="0E0E0E"/>
+          <w:sz w:val="18"/>
+          <w:szCs w:val="18"/>
+          <w:lang w:eastAsia="pl-PL"/>
+        </w:rPr>
+      </w:r>
+      <w:r>
+        <w:rPr>
+          <w:rFonts w:ascii="Times New Roman" w:hAnsi="Times New Roman" w:eastAsia="Times New Roman"/>
           <w:color w:val="0E0E0E"/>
           <w:sz w:val="18"/>
           <w:szCs w:val="18"/>
@@ -763,16 +890,16 @@
         <w:ind w:firstLine="570"/>
         <w:jc w:val="right"/>
         <w:rPr>
-          <w:rFonts w:ascii="Times New Roman" w:eastAsia="Times New Roman" w:hAnsi="Times New Roman"/>
-          <w:color w:val="0E0E0E"/>
-          <w:sz w:val="20"/>
-          <w:szCs w:val="20"/>
-          <w:lang w:eastAsia="pl-PL"/>
-        </w:rPr>
-      </w:pPr>
-      <w:r>
-        <w:rPr>
-          <w:rFonts w:ascii="Times New Roman" w:eastAsia="Times New Roman" w:hAnsi="Times New Roman"/>
+          <w:rFonts w:ascii="Times New Roman" w:hAnsi="Times New Roman" w:eastAsia="Times New Roman"/>
+          <w:color w:val="0E0E0E"/>
+          <w:sz w:val="20"/>
+          <w:szCs w:val="20"/>
+          <w:lang w:eastAsia="pl-PL"/>
+        </w:rPr>
+      </w:pPr>
+      <w:r>
+        <w:rPr>
+          <w:rFonts w:ascii="Times New Roman" w:hAnsi="Times New Roman" w:eastAsia="Times New Roman"/>
           <w:color w:val="0E0E0E"/>
           <w:sz w:val="18"/>
           <w:szCs w:val="18"/>
@@ -783,7 +910,7 @@
       <w:proofErr w:type="spellStart"/>
       <w:r>
         <w:rPr>
-          <w:rFonts w:ascii="Times New Roman" w:eastAsia="Times New Roman" w:hAnsi="Times New Roman"/>
+          <w:rFonts w:ascii="Times New Roman" w:hAnsi="Times New Roman" w:eastAsia="Times New Roman"/>
           <w:color w:val="0E0E0E"/>
           <w:sz w:val="18"/>
           <w:szCs w:val="18"/>
@@ -793,7 +920,7 @@
       <w:proofErr w:type="spellEnd"/>
       <w:r>
         <w:rPr>
-          <w:rFonts w:ascii="Times New Roman" w:eastAsia="Times New Roman" w:hAnsi="Times New Roman"/>
+          <w:rFonts w:ascii="Times New Roman" w:hAnsi="Times New Roman" w:eastAsia="Times New Roman"/>
           <w:color w:val="0E0E0E"/>
           <w:sz w:val="18"/>
           <w:szCs w:val="18"/>
@@ -802,25 +929,25 @@
       </w:r>
       <w:r>
         <w:rPr>
-          <w:rFonts w:ascii="Times New Roman" w:eastAsia="Times New Roman" w:hAnsi="Times New Roman"/>
-          <w:color w:val="0E0E0E"/>
-          <w:sz w:val="20"/>
-          <w:szCs w:val="20"/>
-          <w:lang w:eastAsia="pl-PL"/>
-        </w:rPr>
-      </w:r>
-      <w:r>
-        <w:rPr>
-          <w:rFonts w:ascii="Times New Roman" w:eastAsia="Times New Roman" w:hAnsi="Times New Roman"/>
-          <w:color w:val="0E0E0E"/>
-          <w:sz w:val="20"/>
-          <w:szCs w:val="20"/>
-          <w:lang w:eastAsia="pl-PL"/>
-        </w:rPr>
-      </w:r>
-      <w:r>
-        <w:rPr>
-          <w:rFonts w:ascii="Times New Roman" w:eastAsia="Times New Roman" w:hAnsi="Times New Roman"/>
+          <w:rFonts w:ascii="Times New Roman" w:hAnsi="Times New Roman" w:eastAsia="Times New Roman"/>
+          <w:color w:val="0E0E0E"/>
+          <w:sz w:val="20"/>
+          <w:szCs w:val="20"/>
+          <w:lang w:eastAsia="pl-PL"/>
+        </w:rPr>
+      </w:r>
+      <w:r>
+        <w:rPr>
+          <w:rFonts w:ascii="Times New Roman" w:hAnsi="Times New Roman" w:eastAsia="Times New Roman"/>
+          <w:color w:val="0E0E0E"/>
+          <w:sz w:val="20"/>
+          <w:szCs w:val="20"/>
+          <w:lang w:eastAsia="pl-PL"/>
+        </w:rPr>
+      </w:r>
+      <w:r>
+        <w:rPr>
+          <w:rFonts w:ascii="Times New Roman" w:hAnsi="Times New Roman" w:eastAsia="Times New Roman"/>
           <w:color w:val="0E0E0E"/>
           <w:sz w:val="20"/>
           <w:szCs w:val="20"/>
@@ -833,16 +960,16 @@
         <w:spacing w:before="120" w:after="0" w:line="360" w:lineRule="auto"/>
         <w:jc w:val="right"/>
         <w:rPr>
-          <w:rFonts w:ascii="Times New Roman" w:eastAsia="Times New Roman" w:hAnsi="Times New Roman"/>
-          <w:color w:val="0E0E0E"/>
-          <w:sz w:val="20"/>
-          <w:szCs w:val="20"/>
-          <w:lang w:eastAsia="pl-PL"/>
-        </w:rPr>
-      </w:pPr>
-      <w:r>
-        <w:rPr>
-          <w:rFonts w:ascii="Times New Roman" w:eastAsia="Times New Roman" w:hAnsi="Times New Roman"/>
+          <w:rFonts w:ascii="Times New Roman" w:hAnsi="Times New Roman" w:eastAsia="Times New Roman"/>
+          <w:color w:val="0E0E0E"/>
+          <w:sz w:val="20"/>
+          <w:szCs w:val="20"/>
+          <w:lang w:eastAsia="pl-PL"/>
+        </w:rPr>
+      </w:pPr>
+      <w:r>
+        <w:rPr>
+          <w:rFonts w:ascii="Times New Roman" w:hAnsi="Times New Roman" w:eastAsia="Times New Roman"/>
           <w:b/>
           <w:color w:val="0E0E0E"/>
           <w:sz w:val="20"/>
@@ -853,7 +980,7 @@
       </w:r>
       <w:r>
         <w:rPr>
-          <w:rFonts w:ascii="Times New Roman" w:eastAsia="Times New Roman" w:hAnsi="Times New Roman"/>
+          <w:rFonts w:ascii="Times New Roman" w:hAnsi="Times New Roman" w:eastAsia="Times New Roman"/>
           <w:b/>
           <w:color w:val="0E0E0E"/>
           <w:sz w:val="20"/>
@@ -864,34 +991,34 @@
       </w:r>
       <w:r>
         <w:rPr>
-          <w:rFonts w:ascii="Times New Roman" w:eastAsia="Times New Roman" w:hAnsi="Times New Roman"/>
-          <w:color w:val="0E0E0E"/>
-          <w:sz w:val="20"/>
-          <w:szCs w:val="20"/>
-          <w:lang w:eastAsia="pl-PL"/>
-        </w:rPr>
-      </w:r>
-      <w:r>
-        <w:rPr>
-          <w:rFonts w:ascii="Times New Roman" w:eastAsia="Times New Roman" w:hAnsi="Times New Roman"/>
-          <w:color w:val="0E0E0E"/>
-          <w:sz w:val="20"/>
-          <w:szCs w:val="20"/>
-          <w:lang w:eastAsia="pl-PL"/>
-        </w:rPr>
-      </w:r>
-      <w:r>
-        <w:rPr>
-          <w:rFonts w:ascii="Times New Roman" w:eastAsia="Times New Roman" w:hAnsi="Times New Roman"/>
-          <w:color w:val="0E0E0E"/>
-          <w:sz w:val="20"/>
-          <w:szCs w:val="20"/>
-          <w:lang w:eastAsia="pl-PL"/>
-        </w:rPr>
-      </w:r>
-      <w:r>
-        <w:rPr>
-          <w:rFonts w:ascii="Times New Roman" w:eastAsia="Times New Roman" w:hAnsi="Times New Roman"/>
+          <w:rFonts w:ascii="Times New Roman" w:hAnsi="Times New Roman" w:eastAsia="Times New Roman"/>
+          <w:color w:val="0E0E0E"/>
+          <w:sz w:val="20"/>
+          <w:szCs w:val="20"/>
+          <w:lang w:eastAsia="pl-PL"/>
+        </w:rPr>
+      </w:r>
+      <w:r>
+        <w:rPr>
+          <w:rFonts w:ascii="Times New Roman" w:hAnsi="Times New Roman" w:eastAsia="Times New Roman"/>
+          <w:color w:val="0E0E0E"/>
+          <w:sz w:val="20"/>
+          <w:szCs w:val="20"/>
+          <w:lang w:eastAsia="pl-PL"/>
+        </w:rPr>
+      </w:r>
+      <w:r>
+        <w:rPr>
+          <w:rFonts w:ascii="Times New Roman" w:hAnsi="Times New Roman" w:eastAsia="Times New Roman"/>
+          <w:color w:val="0E0E0E"/>
+          <w:sz w:val="20"/>
+          <w:szCs w:val="20"/>
+          <w:lang w:eastAsia="pl-PL"/>
+        </w:rPr>
+      </w:r>
+      <w:r>
+        <w:rPr>
+          <w:rFonts w:ascii="Times New Roman" w:hAnsi="Times New Roman" w:eastAsia="Times New Roman"/>
           <w:color w:val="0E0E0E"/>
           <w:sz w:val="20"/>
           <w:szCs w:val="20"/>
@@ -904,16 +1031,16 @@
         <w:spacing w:after="0" w:line="360" w:lineRule="auto"/>
         <w:jc w:val="right"/>
         <w:rPr>
-          <w:rFonts w:ascii="Times New Roman" w:eastAsia="Times New Roman" w:hAnsi="Times New Roman"/>
-          <w:color w:val="0E0E0E"/>
-          <w:sz w:val="20"/>
-          <w:szCs w:val="20"/>
-          <w:lang w:eastAsia="pl-PL"/>
-        </w:rPr>
-      </w:pPr>
-      <w:r>
-        <w:rPr>
-          <w:rFonts w:ascii="Times New Roman" w:eastAsia="Times New Roman" w:hAnsi="Times New Roman"/>
+          <w:rFonts w:ascii="Times New Roman" w:hAnsi="Times New Roman" w:eastAsia="Times New Roman"/>
+          <w:color w:val="0E0E0E"/>
+          <w:sz w:val="20"/>
+          <w:szCs w:val="20"/>
+          <w:lang w:eastAsia="pl-PL"/>
+        </w:rPr>
+      </w:pPr>
+      <w:r>
+        <w:rPr>
+          <w:rFonts w:ascii="Times New Roman" w:hAnsi="Times New Roman" w:eastAsia="Times New Roman"/>
           <w:b/>
           <w:color w:val="0E0E0E"/>
           <w:sz w:val="20"/>
@@ -924,7 +1051,7 @@
       </w:r>
       <w:r>
         <w:rPr>
-          <w:rFonts w:ascii="Times New Roman" w:eastAsia="Times New Roman" w:hAnsi="Times New Roman"/>
+          <w:rFonts w:ascii="Times New Roman" w:hAnsi="Times New Roman" w:eastAsia="Times New Roman"/>
           <w:color w:val="0E0E0E"/>
           <w:sz w:val="20"/>
           <w:szCs w:val="20"/>
@@ -934,7 +1061,7 @@
       </w:r>
       <w:r>
         <w:rPr>
-          <w:rFonts w:ascii="Times New Roman" w:eastAsia="Times New Roman" w:hAnsi="Times New Roman"/>
+          <w:rFonts w:ascii="Times New Roman" w:hAnsi="Times New Roman" w:eastAsia="Times New Roman"/>
           <w:color w:val="0E0E0E"/>
           <w:sz w:val="20"/>
           <w:szCs w:val="20"/>
@@ -947,16 +1074,16 @@
         <w:spacing w:after="120" w:line="360" w:lineRule="auto"/>
         <w:jc w:val="right"/>
         <w:rPr>
-          <w:rFonts w:ascii="Times New Roman" w:eastAsia="Times New Roman" w:hAnsi="Times New Roman"/>
-          <w:color w:val="0E0E0E"/>
-          <w:sz w:val="20"/>
-          <w:szCs w:val="20"/>
-          <w:lang w:eastAsia="pl-PL"/>
-        </w:rPr>
-      </w:pPr>
-      <w:r>
-        <w:rPr>
-          <w:rFonts w:ascii="Times New Roman" w:eastAsia="Times New Roman" w:hAnsi="Times New Roman"/>
+          <w:rFonts w:ascii="Times New Roman" w:hAnsi="Times New Roman" w:eastAsia="Times New Roman"/>
+          <w:color w:val="0E0E0E"/>
+          <w:sz w:val="20"/>
+          <w:szCs w:val="20"/>
+          <w:lang w:eastAsia="pl-PL"/>
+        </w:rPr>
+      </w:pPr>
+      <w:r>
+        <w:rPr>
+          <w:rFonts w:ascii="Times New Roman" w:hAnsi="Times New Roman" w:eastAsia="Times New Roman"/>
           <w:b/>
           <w:color w:val="0E0E0E"/>
           <w:sz w:val="20"/>
@@ -967,7 +1094,7 @@
       </w:r>
       <w:r>
         <w:rPr>
-          <w:rFonts w:ascii="Times New Roman" w:eastAsia="Times New Roman" w:hAnsi="Times New Roman"/>
+          <w:rFonts w:ascii="Times New Roman" w:hAnsi="Times New Roman" w:eastAsia="Times New Roman"/>
           <w:color w:val="0E0E0E"/>
           <w:sz w:val="20"/>
           <w:szCs w:val="20"/>
@@ -977,7 +1104,7 @@
       </w:r>
       <w:r>
         <w:rPr>
-          <w:rFonts w:ascii="Times New Roman" w:eastAsia="Times New Roman" w:hAnsi="Times New Roman"/>
+          <w:rFonts w:ascii="Times New Roman" w:hAnsi="Times New Roman" w:eastAsia="Times New Roman"/>
           <w:color w:val="0E0E0E"/>
           <w:sz w:val="20"/>
           <w:szCs w:val="20"/>
@@ -990,7 +1117,7 @@
         <w:spacing w:after="120" w:line="240" w:lineRule="auto"/>
         <w:jc w:val="right"/>
         <w:rPr>
-          <w:rFonts w:ascii="Times New Roman" w:eastAsia="Times New Roman" w:hAnsi="Times New Roman"/>
+          <w:rFonts w:ascii="Times New Roman" w:hAnsi="Times New Roman" w:eastAsia="Times New Roman"/>
           <w:color w:val="0E0E0E"/>
           <w:sz w:val="18"/>
           <w:szCs w:val="18"/>
@@ -999,7 +1126,7 @@
       </w:pPr>
       <w:r>
         <w:rPr>
-          <w:rFonts w:ascii="Times New Roman" w:eastAsia="Times New Roman" w:hAnsi="Times New Roman"/>
+          <w:rFonts w:ascii="Times New Roman" w:hAnsi="Times New Roman" w:eastAsia="Times New Roman"/>
           <w:color w:val="0E0E0E"/>
           <w:sz w:val="18"/>
           <w:szCs w:val="18"/>
@@ -1009,7 +1136,7 @@
       </w:r>
       <w:r>
         <w:rPr>
-          <w:rFonts w:ascii="Times New Roman" w:eastAsia="Times New Roman" w:hAnsi="Times New Roman"/>
+          <w:rFonts w:ascii="Times New Roman" w:hAnsi="Times New Roman" w:eastAsia="Times New Roman"/>
           <w:color w:val="0E0E0E"/>
           <w:sz w:val="18"/>
           <w:szCs w:val="18"/>
@@ -1018,7 +1145,7 @@
       </w:r>
       <w:r>
         <w:rPr>
-          <w:rFonts w:ascii="Times New Roman" w:eastAsia="Times New Roman" w:hAnsi="Times New Roman"/>
+          <w:rFonts w:ascii="Times New Roman" w:hAnsi="Times New Roman" w:eastAsia="Times New Roman"/>
           <w:color w:val="0E0E0E"/>
           <w:sz w:val="18"/>
           <w:szCs w:val="18"/>
@@ -1031,7 +1158,7 @@
         <w:spacing w:after="120" w:line="240" w:lineRule="auto"/>
         <w:jc w:val="right"/>
         <w:rPr>
-          <w:rFonts w:ascii="Times New Roman" w:eastAsia="Times New Roman" w:hAnsi="Times New Roman"/>
+          <w:rFonts w:ascii="Times New Roman" w:hAnsi="Times New Roman" w:eastAsia="Times New Roman"/>
           <w:color w:val="0E0E0E"/>
           <w:sz w:val="18"/>
           <w:szCs w:val="18"/>
@@ -1040,7 +1167,7 @@
       </w:pPr>
       <w:r>
         <w:rPr>
-          <w:rFonts w:ascii="Times New Roman" w:eastAsia="Times New Roman" w:hAnsi="Times New Roman"/>
+          <w:rFonts w:ascii="Times New Roman" w:hAnsi="Times New Roman" w:eastAsia="Times New Roman"/>
           <w:color w:val="0E0E0E"/>
           <w:sz w:val="18"/>
           <w:szCs w:val="18"/>
@@ -1050,7 +1177,7 @@
       </w:r>
       <w:r>
         <w:rPr>
-          <w:rFonts w:ascii="Times New Roman" w:eastAsia="Times New Roman" w:hAnsi="Times New Roman"/>
+          <w:rFonts w:ascii="Times New Roman" w:hAnsi="Times New Roman" w:eastAsia="Times New Roman"/>
           <w:color w:val="0E0E0E"/>
           <w:sz w:val="18"/>
           <w:szCs w:val="18"/>
@@ -1060,232 +1187,302 @@
     </w:p>
     <w:p>
       <w:pPr>
+        <w:pStyle w:val="Normalny"/>
         <w:spacing w:after="120" w:line="240" w:lineRule="auto"/>
         <w:jc w:val="right"/>
         <w:rPr>
-          <w:rFonts w:ascii="Times New Roman" w:eastAsia="Times New Roman" w:hAnsi="Times New Roman"/>
+          <w:rFonts w:ascii="Times New Roman" w:hAnsi="Times New Roman" w:eastAsia="Times New Roman"/>
           <w:color w:val="0E0E0E"/>
           <w:sz w:val="18"/>
           <w:szCs w:val="18"/>
           <w:lang w:eastAsia="pl-PL"/>
         </w:rPr>
       </w:pPr>
-      <w:r>
-        <w:rPr>
-          <w:rFonts w:ascii="Times New Roman" w:eastAsia="Times New Roman" w:hAnsi="Times New Roman"/>
+    </w:p>
+    <w:p>
+      <w:pPr>
+        <w:spacing w:after="0" w:line="240" w:lineRule="auto"/>
+        <w:rPr>
+          <w:rFonts w:ascii="Times New Roman" w:hAnsi="Times New Roman" w:eastAsia="Times New Roman"/>
           <w:color w:val="0E0E0E"/>
           <w:sz w:val="18"/>
           <w:szCs w:val="18"/>
           <w:lang w:eastAsia="pl-PL"/>
         </w:rPr>
+      </w:pPr>
+      <w:r>
+        <w:rPr>
+          <w:rFonts w:ascii="Times New Roman" w:hAnsi="Times New Roman" w:eastAsia="Times New Roman"/>
+          <w:color w:val="0E0E0E"/>
+          <w:sz w:val="18"/>
+          <w:szCs w:val="18"/>
+          <w:lang w:eastAsia="pl-PL"/>
+        </w:rPr>
+        <w:t>……………</w:t>
+      </w:r>
+      <w:r>
+        <w:rPr>
+          <w:rFonts w:ascii="Times New Roman" w:hAnsi="Times New Roman" w:eastAsia="Times New Roman"/>
+          <w:color w:val="0E0E0E"/>
+          <w:sz w:val="18"/>
+          <w:szCs w:val="18"/>
+          <w:lang w:eastAsia="pl-PL"/>
+        </w:rPr>
+        <w:t>…………</w:t>
+      </w:r>
+      <w:r>
+        <w:rPr>
+          <w:rFonts w:ascii="Times New Roman" w:hAnsi="Times New Roman" w:eastAsia="Times New Roman"/>
+          <w:color w:val="0E0E0E"/>
+          <w:sz w:val="18"/>
+          <w:szCs w:val="18"/>
+          <w:lang w:eastAsia="pl-PL"/>
+        </w:rPr>
+        <w:t>……….</w:t>
       </w:r>
     </w:p>
     <w:p>
       <w:pPr>
-        <w:spacing w:after="120" w:line="240" w:lineRule="auto"/>
-        <w:jc w:val="right"/>
-        <w:rPr>
-          <w:rFonts w:ascii="Times New Roman" w:eastAsia="Times New Roman" w:hAnsi="Times New Roman"/>
-          <w:color w:val="0E0E0E"/>
-          <w:sz w:val="18"/>
-          <w:szCs w:val="18"/>
-          <w:lang w:eastAsia="pl-PL"/>
-        </w:rPr>
-      </w:pPr>
-      <w:r>
-        <w:rPr>
-          <w:rFonts w:ascii="Times New Roman" w:eastAsia="Times New Roman" w:hAnsi="Times New Roman"/>
-          <w:color w:val="0E0E0E"/>
-          <w:sz w:val="18"/>
-          <w:szCs w:val="18"/>
-          <w:lang w:eastAsia="pl-PL"/>
-        </w:rPr>
+        <w:spacing w:after="0" w:line="240" w:lineRule="auto"/>
+        <w:rPr>
+          <w:rFonts w:ascii="Times New Roman" w:hAnsi="Times New Roman" w:eastAsia="Times New Roman"/>
+          <w:color w:val="0E0E0E"/>
+          <w:sz w:val="16"/>
+          <w:szCs w:val="16"/>
+          <w:lang w:eastAsia="pl-PL"/>
+        </w:rPr>
+      </w:pPr>
+      <w:r>
+        <w:rPr>
+          <w:rFonts w:ascii="Times New Roman" w:hAnsi="Times New Roman" w:eastAsia="Times New Roman"/>
+          <w:color w:val="0E0E0E"/>
+          <w:sz w:val="16"/>
+          <w:szCs w:val="16"/>
+          <w:lang w:eastAsia="pl-PL"/>
+        </w:rPr>
+        <w:t xml:space="preserve">          </w:t>
+      </w:r>
+      <w:r>
+        <w:rPr>
+          <w:rFonts w:ascii="Times New Roman" w:hAnsi="Times New Roman" w:eastAsia="Times New Roman"/>
+          <w:color w:val="0E0E0E"/>
+          <w:sz w:val="16"/>
+          <w:szCs w:val="16"/>
+          <w:lang w:eastAsia="pl-PL"/>
+        </w:rPr>
+        <w:t>(podpis rozliczającego)</w:t>
       </w:r>
     </w:p>
     <w:p>
       <w:pPr>
         <w:spacing w:after="0" w:line="240" w:lineRule="auto"/>
         <w:rPr>
-          <w:rFonts w:ascii="Times New Roman" w:eastAsia="Times New Roman" w:hAnsi="Times New Roman"/>
-          <w:color w:val="0E0E0E"/>
-          <w:sz w:val="18"/>
-          <w:szCs w:val="18"/>
-          <w:lang w:eastAsia="pl-PL"/>
-        </w:rPr>
-      </w:pPr>
-      <w:r>
-        <w:rPr>
-          <w:rFonts w:ascii="Times New Roman" w:eastAsia="Times New Roman" w:hAnsi="Times New Roman"/>
-          <w:color w:val="0E0E0E"/>
-          <w:sz w:val="18"/>
-          <w:szCs w:val="18"/>
-          <w:lang w:eastAsia="pl-PL"/>
-        </w:rPr>
-        <w:t>……………</w:t>
-      </w:r>
-      <w:r>
-        <w:rPr>
-          <w:rFonts w:ascii="Times New Roman" w:eastAsia="Times New Roman" w:hAnsi="Times New Roman"/>
-          <w:color w:val="0E0E0E"/>
-          <w:sz w:val="18"/>
-          <w:szCs w:val="18"/>
-          <w:lang w:eastAsia="pl-PL"/>
-        </w:rPr>
-        <w:t>…………</w:t>
-      </w:r>
-      <w:r>
-        <w:rPr>
-          <w:rFonts w:ascii="Times New Roman" w:eastAsia="Times New Roman" w:hAnsi="Times New Roman"/>
-          <w:color w:val="0E0E0E"/>
-          <w:sz w:val="18"/>
-          <w:szCs w:val="18"/>
-          <w:lang w:eastAsia="pl-PL"/>
-        </w:rPr>
-        <w:t>……….</w:t>
-      </w:r>
+          <w:rFonts w:ascii="Times New Roman" w:hAnsi="Times New Roman" w:eastAsia="Times New Roman"/>
+          <w:color w:val="0E0E0E"/>
+          <w:sz w:val="16"/>
+          <w:szCs w:val="16"/>
+          <w:lang w:eastAsia="pl-PL"/>
+        </w:rPr>
+      </w:pPr>
     </w:p>
     <w:p>
       <w:pPr>
         <w:spacing w:after="0" w:line="240" w:lineRule="auto"/>
         <w:rPr>
-          <w:rFonts w:ascii="Times New Roman" w:eastAsia="Times New Roman" w:hAnsi="Times New Roman"/>
+          <w:rFonts w:ascii="Times New Roman" w:hAnsi="Times New Roman" w:eastAsia="Times New Roman"/>
           <w:color w:val="0E0E0E"/>
           <w:sz w:val="16"/>
           <w:szCs w:val="16"/>
           <w:lang w:eastAsia="pl-PL"/>
         </w:rPr>
       </w:pPr>
-      <w:r>
-        <w:rPr>
-          <w:rFonts w:ascii="Times New Roman" w:eastAsia="Times New Roman" w:hAnsi="Times New Roman"/>
+    </w:p>
+    <w:p>
+      <w:pPr>
+        <w:spacing w:after="0" w:line="240" w:lineRule="auto"/>
+        <w:rPr>
+          <w:rFonts w:ascii="Times New Roman" w:hAnsi="Times New Roman" w:eastAsia="Times New Roman"/>
           <w:color w:val="0E0E0E"/>
           <w:sz w:val="16"/>
           <w:szCs w:val="16"/>
           <w:lang w:eastAsia="pl-PL"/>
         </w:rPr>
-        <w:t xml:space="preserve">          </w:t>
-      </w:r>
-      <w:r>
-        <w:rPr>
-          <w:rFonts w:ascii="Times New Roman" w:eastAsia="Times New Roman" w:hAnsi="Times New Roman"/>
-          <w:color w:val="0E0E0E"/>
-          <w:sz w:val="16"/>
-          <w:szCs w:val="16"/>
-          <w:lang w:eastAsia="pl-PL"/>
-        </w:rPr>
-        <w:t>(podpis rozliczającego)</w:t>
-      </w:r>
+      </w:pPr>
     </w:p>
     <w:p>
       <w:pPr>
         <w:spacing w:after="0" w:line="240" w:lineRule="auto"/>
-        <w:rPr>
-          <w:rFonts w:ascii="Times New Roman" w:eastAsia="Times New Roman" w:hAnsi="Times New Roman"/>
-          <w:color w:val="0E0E0E"/>
-          <w:sz w:val="16"/>
-          <w:szCs w:val="16"/>
-          <w:lang w:eastAsia="pl-PL"/>
-        </w:rPr>
-      </w:pPr>
-    </w:p>
-    <w:p>
-      <w:pPr>
-        <w:spacing w:after="0" w:line="240" w:lineRule="auto"/>
-        <w:rPr>
-          <w:rFonts w:ascii="Times New Roman" w:eastAsia="Times New Roman" w:hAnsi="Times New Roman"/>
-          <w:color w:val="0E0E0E"/>
-          <w:sz w:val="16"/>
-          <w:szCs w:val="16"/>
-          <w:lang w:eastAsia="pl-PL"/>
-        </w:rPr>
-      </w:pPr>
-    </w:p>
-    <w:p>
-      <w:pPr>
-        <w:spacing w:after="0" w:line="240" w:lineRule="auto"/>
-        <w:rPr>
-          <w:rFonts w:ascii="Times New Roman" w:eastAsia="Times New Roman" w:hAnsi="Times New Roman"/>
-          <w:color w:val="0E0E0E"/>
-          <w:sz w:val="16"/>
-          <w:szCs w:val="16"/>
-          <w:lang w:eastAsia="pl-PL"/>
-        </w:rPr>
-      </w:pPr>
-    </w:p>
-    <w:p>
-      <w:pPr>
-        <w:spacing w:after="0" w:line="240" w:lineRule="auto"/>
+        <w:ind w:left="708" w:firstLine="708"/>
         <w:jc w:val="right"/>
         <w:rPr>
-          <w:rFonts w:ascii="Times New Roman" w:eastAsia="Times New Roman" w:hAnsi="Times New Roman"/>
-          <w:color w:val="0E0E0E"/>
-          <w:sz w:val="20"/>
-          <w:szCs w:val="20"/>
-          <w:lang w:eastAsia="pl-PL"/>
-        </w:rPr>
-      </w:pPr>
-      <w:r>
-        <w:rPr>
-          <w:rFonts w:ascii="Times New Roman" w:eastAsia="Times New Roman" w:hAnsi="Times New Roman"/>
-          <w:color w:val="0E0E0E"/>
-          <w:sz w:val="20"/>
-          <w:szCs w:val="20"/>
-          <w:lang w:eastAsia="pl-PL"/>
-        </w:rPr>
-        <w:t>{{data_wystawienia}}</w:t>
+          <w:rFonts w:ascii="Times New Roman" w:hAnsi="Times New Roman" w:eastAsia="Times New Roman"/>
+          <w:color w:val="0E0E0E"/>
+          <w:sz w:val="20"/>
+          <w:szCs w:val="20"/>
+          <w:lang w:eastAsia="pl-PL"/>
+        </w:rPr>
+      </w:pPr>
+      <w:r>
+        <w:rPr>
+          <w:rFonts w:ascii="Times New Roman" w:hAnsi="Times New Roman" w:eastAsia="Times New Roman"/>
+          <w:color w:val="0E0E0E"/>
+          <w:sz w:val="20"/>
+          <w:szCs w:val="20"/>
+          <w:lang w:eastAsia="pl-PL"/>
+        </w:rPr>
+        <w:t xml:space="preserve">       </w:t>
+      </w:r>
+      <w:r>
         <w:tab/>
+      </w:r>
+      <w:r>
+        <w:rPr>
+          <w:rFonts w:ascii="Times New Roman" w:hAnsi="Times New Roman" w:eastAsia="Times New Roman"/>
+          <w:color w:val="0E0E0E"/>
+          <w:sz w:val="20"/>
+          <w:szCs w:val="20"/>
+          <w:lang w:eastAsia="pl-PL"/>
+        </w:rPr>
+        <w:t xml:space="preserve">      </w:t>
+      </w:r>
+      <w:r>
+        <w:rPr>
+          <w:rFonts w:ascii="Times New Roman" w:hAnsi="Times New Roman" w:eastAsia="Times New Roman"/>
+          <w:color w:val="0E0E0E"/>
+          <w:sz w:val="20"/>
+          <w:szCs w:val="20"/>
+          <w:lang w:eastAsia="pl-PL"/>
+        </w:rPr>
+        <w:t>{{</w:t>
+      </w:r>
+      <w:r>
+        <w:rPr>
+          <w:rFonts w:ascii="Times New Roman" w:hAnsi="Times New Roman" w:eastAsia="Times New Roman"/>
+          <w:color w:val="0E0E0E"/>
+          <w:sz w:val="20"/>
+          <w:szCs w:val="20"/>
+          <w:lang w:eastAsia="pl-PL"/>
+        </w:rPr>
+        <w:t>data_wystawienia</w:t>
+      </w:r>
+      <w:r>
+        <w:rPr>
+          <w:rFonts w:ascii="Times New Roman" w:hAnsi="Times New Roman" w:eastAsia="Times New Roman"/>
+          <w:color w:val="0E0E0E"/>
+          <w:sz w:val="20"/>
+          <w:szCs w:val="20"/>
+          <w:lang w:eastAsia="pl-PL"/>
+        </w:rPr>
+        <w:t>}}</w:t>
+      </w:r>
+      <w:r>
+        <w:rPr>
+          <w:rFonts w:ascii="Times New Roman" w:hAnsi="Times New Roman" w:eastAsia="Times New Roman"/>
+          <w:color w:val="0E0E0E"/>
+          <w:sz w:val="20"/>
+          <w:szCs w:val="20"/>
+          <w:lang w:eastAsia="pl-PL"/>
+        </w:rPr>
         <w:tab/>
+      </w:r>
+      <w:r>
+        <w:rPr>
+          <w:rFonts w:ascii="Times New Roman" w:hAnsi="Times New Roman" w:eastAsia="Times New Roman"/>
+          <w:color w:val="0E0E0E"/>
+          <w:sz w:val="20"/>
+          <w:szCs w:val="20"/>
+          <w:lang w:eastAsia="pl-PL"/>
+        </w:rPr>
         <w:tab/>
-        <w:t>…..………………..</w:t>
-      </w:r>
-      <w:r>
-        <w:rPr>
-          <w:rFonts w:ascii="Times New Roman" w:eastAsia="Times New Roman" w:hAnsi="Times New Roman"/>
-          <w:color w:val="0E0E0E"/>
-          <w:sz w:val="20"/>
-          <w:szCs w:val="20"/>
-          <w:lang w:eastAsia="pl-PL"/>
-        </w:rPr>
-      </w:r>
-      <w:r>
-        <w:rPr>
-          <w:rFonts w:ascii="Times New Roman" w:eastAsia="Times New Roman" w:hAnsi="Times New Roman"/>
-          <w:color w:val="0E0E0E"/>
-          <w:sz w:val="20"/>
-          <w:szCs w:val="20"/>
-          <w:lang w:eastAsia="pl-PL"/>
-        </w:rPr>
-      </w:r>
-      <w:r>
-        <w:rPr>
-          <w:rFonts w:ascii="Times New Roman" w:eastAsia="Times New Roman" w:hAnsi="Times New Roman"/>
-          <w:color w:val="0E0E0E"/>
-          <w:sz w:val="20"/>
-          <w:szCs w:val="20"/>
-          <w:lang w:eastAsia="pl-PL"/>
-        </w:rPr>
-      </w:r>
-      <w:r>
-        <w:rPr>
-          <w:rFonts w:ascii="Times New Roman" w:eastAsia="Times New Roman" w:hAnsi="Times New Roman"/>
-          <w:color w:val="0E0E0E"/>
-          <w:sz w:val="20"/>
-          <w:szCs w:val="20"/>
-          <w:lang w:eastAsia="pl-PL"/>
-        </w:rPr>
-      </w:r>
-      <w:r>
-        <w:rPr>
-          <w:rFonts w:ascii="Times New Roman" w:eastAsia="Times New Roman" w:hAnsi="Times New Roman"/>
-          <w:color w:val="0E0E0E"/>
-          <w:sz w:val="20"/>
-          <w:szCs w:val="20"/>
-          <w:lang w:eastAsia="pl-PL"/>
-        </w:rPr>
-      </w:r>
-      <w:r>
-        <w:rPr>
-          <w:rFonts w:ascii="Times New Roman" w:eastAsia="Times New Roman" w:hAnsi="Times New Roman"/>
+      </w:r>
+      <w:r>
+        <w:rPr>
+          <w:rFonts w:ascii="Times New Roman" w:hAnsi="Times New Roman" w:eastAsia="Times New Roman"/>
+          <w:color w:val="0E0E0E"/>
+          <w:sz w:val="20"/>
+          <w:szCs w:val="20"/>
+          <w:lang w:eastAsia="pl-PL"/>
+        </w:rPr>
+        <w:tab/>
+      </w:r>
+      <w:r>
+        <w:rPr>
+          <w:rFonts w:ascii="Times New Roman" w:hAnsi="Times New Roman" w:eastAsia="Times New Roman"/>
+          <w:color w:val="0E0E0E"/>
+          <w:sz w:val="20"/>
+          <w:szCs w:val="20"/>
+          <w:lang w:eastAsia="pl-PL"/>
+        </w:rPr>
+        <w:t>…..…………</w:t>
+      </w:r>
+      <w:r>
+        <w:rPr>
+          <w:rFonts w:ascii="Times New Roman" w:hAnsi="Times New Roman" w:eastAsia="Times New Roman"/>
+          <w:color w:val="0E0E0E"/>
+          <w:sz w:val="20"/>
+          <w:szCs w:val="20"/>
+          <w:lang w:eastAsia="pl-PL"/>
+        </w:rPr>
+        <w:t>…….</w:t>
+      </w:r>
+      <w:r>
+        <w:rPr>
+          <w:rFonts w:ascii="Times New Roman" w:hAnsi="Times New Roman" w:eastAsia="Times New Roman"/>
+          <w:color w:val="0E0E0E"/>
+          <w:sz w:val="20"/>
+          <w:szCs w:val="20"/>
+          <w:lang w:eastAsia="pl-PL"/>
+        </w:rPr>
+        <w:t>.</w:t>
+      </w:r>
+      <w:r>
+        <w:rPr>
+          <w:rFonts w:ascii="Times New Roman" w:hAnsi="Times New Roman" w:eastAsia="Times New Roman"/>
+          <w:color w:val="0E0E0E"/>
+          <w:sz w:val="20"/>
+          <w:szCs w:val="20"/>
+          <w:lang w:eastAsia="pl-PL"/>
+        </w:rPr>
+      </w:r>
+      <w:r>
+        <w:rPr>
+          <w:rFonts w:ascii="Times New Roman" w:hAnsi="Times New Roman" w:eastAsia="Times New Roman"/>
+          <w:color w:val="0E0E0E"/>
+          <w:sz w:val="20"/>
+          <w:szCs w:val="20"/>
+          <w:lang w:eastAsia="pl-PL"/>
+        </w:rPr>
+      </w:r>
+      <w:r>
+        <w:rPr>
+          <w:rFonts w:ascii="Times New Roman" w:hAnsi="Times New Roman" w:eastAsia="Times New Roman"/>
+          <w:color w:val="0E0E0E"/>
+          <w:sz w:val="20"/>
+          <w:szCs w:val="20"/>
+          <w:lang w:eastAsia="pl-PL"/>
+        </w:rPr>
+      </w:r>
+      <w:r>
+        <w:rPr>
+          <w:rFonts w:ascii="Times New Roman" w:hAnsi="Times New Roman" w:eastAsia="Times New Roman"/>
+          <w:color w:val="0E0E0E"/>
+          <w:sz w:val="20"/>
+          <w:szCs w:val="20"/>
+          <w:lang w:eastAsia="pl-PL"/>
+        </w:rPr>
+      </w:r>
+      <w:r>
+        <w:rPr>
+          <w:rFonts w:ascii="Times New Roman" w:hAnsi="Times New Roman" w:eastAsia="Times New Roman"/>
+          <w:color w:val="0E0E0E"/>
+          <w:sz w:val="20"/>
+          <w:szCs w:val="20"/>
+          <w:lang w:eastAsia="pl-PL"/>
+        </w:rPr>
+      </w:r>
+      <w:r>
+        <w:rPr>
+          <w:rFonts w:ascii="Times New Roman" w:hAnsi="Times New Roman" w:eastAsia="Times New Roman"/>
           <w:color w:val="0E0E0E"/>
           <w:sz w:val="20"/>
           <w:szCs w:val="20"/>
@@ -1299,7 +1496,7 @@
         <w:ind w:left="2268"/>
         <w:jc w:val="center"/>
         <w:rPr>
-          <w:rFonts w:ascii="Times New Roman" w:eastAsia="Times New Roman" w:hAnsi="Times New Roman"/>
+          <w:rFonts w:ascii="Times New Roman" w:hAnsi="Times New Roman" w:eastAsia="Times New Roman"/>
           <w:color w:val="0E0E0E"/>
           <w:sz w:val="16"/>
           <w:szCs w:val="16"/>
@@ -1308,7 +1505,7 @@
       </w:pPr>
       <w:r>
         <w:rPr>
-          <w:rFonts w:ascii="Times New Roman" w:eastAsia="Times New Roman" w:hAnsi="Times New Roman"/>
+          <w:rFonts w:ascii="Times New Roman" w:hAnsi="Times New Roman" w:eastAsia="Times New Roman"/>
           <w:color w:val="0E0E0E"/>
           <w:sz w:val="16"/>
           <w:szCs w:val="16"/>
@@ -1318,7 +1515,7 @@
       </w:r>
       <w:r>
         <w:rPr>
-          <w:rFonts w:ascii="Times New Roman" w:eastAsia="Times New Roman" w:hAnsi="Times New Roman"/>
+          <w:rFonts w:ascii="Times New Roman" w:hAnsi="Times New Roman" w:eastAsia="Times New Roman"/>
           <w:color w:val="0E0E0E"/>
           <w:sz w:val="16"/>
           <w:szCs w:val="16"/>
@@ -1328,7 +1525,7 @@
       </w:r>
       <w:r>
         <w:rPr>
-          <w:rFonts w:ascii="Times New Roman" w:eastAsia="Times New Roman" w:hAnsi="Times New Roman"/>
+          <w:rFonts w:ascii="Times New Roman" w:hAnsi="Times New Roman" w:eastAsia="Times New Roman"/>
           <w:color w:val="0E0E0E"/>
           <w:sz w:val="16"/>
           <w:szCs w:val="16"/>
@@ -1338,7 +1535,7 @@
       </w:r>
       <w:r>
         <w:rPr>
-          <w:rFonts w:ascii="Times New Roman" w:eastAsia="Times New Roman" w:hAnsi="Times New Roman"/>
+          <w:rFonts w:ascii="Times New Roman" w:hAnsi="Times New Roman" w:eastAsia="Times New Roman"/>
           <w:color w:val="0E0E0E"/>
           <w:sz w:val="24"/>
           <w:szCs w:val="24"/>
@@ -1348,7 +1545,7 @@
       </w:r>
       <w:r>
         <w:rPr>
-          <w:rFonts w:ascii="Times New Roman" w:eastAsia="Times New Roman" w:hAnsi="Times New Roman"/>
+          <w:rFonts w:ascii="Times New Roman" w:hAnsi="Times New Roman" w:eastAsia="Times New Roman"/>
           <w:color w:val="0E0E0E"/>
           <w:sz w:val="24"/>
           <w:szCs w:val="24"/>
@@ -1358,7 +1555,7 @@
       </w:r>
       <w:r>
         <w:rPr>
-          <w:rFonts w:ascii="Times New Roman" w:eastAsia="Times New Roman" w:hAnsi="Times New Roman"/>
+          <w:rFonts w:ascii="Times New Roman" w:hAnsi="Times New Roman" w:eastAsia="Times New Roman"/>
           <w:color w:val="0E0E0E"/>
           <w:sz w:val="24"/>
           <w:szCs w:val="24"/>
@@ -1368,7 +1565,7 @@
       </w:r>
       <w:r>
         <w:rPr>
-          <w:rFonts w:ascii="Times New Roman" w:eastAsia="Times New Roman" w:hAnsi="Times New Roman"/>
+          <w:rFonts w:ascii="Times New Roman" w:hAnsi="Times New Roman" w:eastAsia="Times New Roman"/>
           <w:color w:val="0E0E0E"/>
           <w:sz w:val="24"/>
           <w:szCs w:val="24"/>
@@ -1378,7 +1575,7 @@
       </w:r>
       <w:r>
         <w:rPr>
-          <w:rFonts w:ascii="Times New Roman" w:eastAsia="Times New Roman" w:hAnsi="Times New Roman"/>
+          <w:rFonts w:ascii="Times New Roman" w:hAnsi="Times New Roman" w:eastAsia="Times New Roman"/>
           <w:color w:val="0E0E0E"/>
           <w:sz w:val="16"/>
           <w:szCs w:val="16"/>
@@ -1388,7 +1585,7 @@
       </w:r>
       <w:r>
         <w:rPr>
-          <w:rFonts w:ascii="Times New Roman" w:eastAsia="Times New Roman" w:hAnsi="Times New Roman"/>
+          <w:rFonts w:ascii="Times New Roman" w:hAnsi="Times New Roman" w:eastAsia="Times New Roman"/>
           <w:color w:val="0E0E0E"/>
           <w:sz w:val="16"/>
           <w:szCs w:val="16"/>
@@ -1398,7 +1595,7 @@
       </w:r>
       <w:r>
         <w:rPr>
-          <w:rFonts w:ascii="Times New Roman" w:eastAsia="Times New Roman" w:hAnsi="Times New Roman"/>
+          <w:rFonts w:ascii="Times New Roman" w:hAnsi="Times New Roman" w:eastAsia="Times New Roman"/>
           <w:color w:val="0E0E0E"/>
           <w:sz w:val="16"/>
           <w:szCs w:val="16"/>
@@ -1407,12 +1604,20 @@
         <w:t>)</w:t>
       </w:r>
     </w:p>
-    <w:sectPr>
-      <w:pgSz w:w="16838" w:h="11906" w:orient="landscape"/>
-      <w:pgMar w:top="1134" w:right="851" w:bottom="1134" w:left="851" w:header="709" w:footer="709" w:gutter="0"/>
-      <w:cols w:num="2" w:space="708"/>
-      <w:docGrid w:linePitch="360"/>
-    </w:sectPr>
+    <w:p>
+      <w:pPr>
+        <w:spacing w:after="0" w:line="240" w:lineRule="auto"/>
+      </w:pPr>
+      <w:r>
+        <w:br/>
+      </w:r>
+    </w:p>
+    <w:p>
+      <w:pPr>
+        <w:pStyle w:val="Normalny"/>
+        <w:spacing w:after="40" w:afterAutospacing="off" w:line="240" w:lineRule="auto"/>
+      </w:pPr>
+    </w:p>
   </w:body>
 </w:document>
 </file>
@@ -1435,7 +1640,7 @@
         <w:ind w:left="720" w:hanging="360"/>
       </w:pPr>
       <w:rPr>
-        <w:rFonts w:ascii="Symbol" w:hAnsi="Symbol" w:hint="default"/>
+        <w:rFonts w:hint="default" w:ascii="Symbol" w:hAnsi="Symbol"/>
         <w:sz w:val="20"/>
       </w:rPr>
     </w:lvl>
@@ -1451,7 +1656,7 @@
         <w:ind w:left="1440" w:hanging="360"/>
       </w:pPr>
       <w:rPr>
-        <w:rFonts w:ascii="Courier New" w:hAnsi="Courier New" w:hint="default"/>
+        <w:rFonts w:hint="default" w:ascii="Courier New" w:hAnsi="Courier New"/>
         <w:sz w:val="20"/>
       </w:rPr>
     </w:lvl>
@@ -1467,7 +1672,7 @@
         <w:ind w:left="2160" w:hanging="360"/>
       </w:pPr>
       <w:rPr>
-        <w:rFonts w:ascii="Wingdings" w:hAnsi="Wingdings" w:hint="default"/>
+        <w:rFonts w:hint="default" w:ascii="Wingdings" w:hAnsi="Wingdings"/>
         <w:sz w:val="20"/>
       </w:rPr>
     </w:lvl>
@@ -1483,7 +1688,7 @@
         <w:ind w:left="2880" w:hanging="360"/>
       </w:pPr>
       <w:rPr>
-        <w:rFonts w:ascii="Wingdings" w:hAnsi="Wingdings" w:hint="default"/>
+        <w:rFonts w:hint="default" w:ascii="Wingdings" w:hAnsi="Wingdings"/>
         <w:sz w:val="20"/>
       </w:rPr>
     </w:lvl>
@@ -1499,7 +1704,7 @@
         <w:ind w:left="3600" w:hanging="360"/>
       </w:pPr>
       <w:rPr>
-        <w:rFonts w:ascii="Wingdings" w:hAnsi="Wingdings" w:hint="default"/>
+        <w:rFonts w:hint="default" w:ascii="Wingdings" w:hAnsi="Wingdings"/>
         <w:sz w:val="20"/>
       </w:rPr>
     </w:lvl>
@@ -1515,7 +1720,7 @@
         <w:ind w:left="4320" w:hanging="360"/>
       </w:pPr>
       <w:rPr>
-        <w:rFonts w:ascii="Wingdings" w:hAnsi="Wingdings" w:hint="default"/>
+        <w:rFonts w:hint="default" w:ascii="Wingdings" w:hAnsi="Wingdings"/>
         <w:sz w:val="20"/>
       </w:rPr>
     </w:lvl>
@@ -1531,7 +1736,7 @@
         <w:ind w:left="5040" w:hanging="360"/>
       </w:pPr>
       <w:rPr>
-        <w:rFonts w:ascii="Wingdings" w:hAnsi="Wingdings" w:hint="default"/>
+        <w:rFonts w:hint="default" w:ascii="Wingdings" w:hAnsi="Wingdings"/>
         <w:sz w:val="20"/>
       </w:rPr>
     </w:lvl>
@@ -1547,7 +1752,7 @@
         <w:ind w:left="5760" w:hanging="360"/>
       </w:pPr>
       <w:rPr>
-        <w:rFonts w:ascii="Wingdings" w:hAnsi="Wingdings" w:hint="default"/>
+        <w:rFonts w:hint="default" w:ascii="Wingdings" w:hAnsi="Wingdings"/>
         <w:sz w:val="20"/>
       </w:rPr>
     </w:lvl>
@@ -1563,7 +1768,7 @@
         <w:ind w:left="6480" w:hanging="360"/>
       </w:pPr>
       <w:rPr>
-        <w:rFonts w:ascii="Wingdings" w:hAnsi="Wingdings" w:hint="default"/>
+        <w:rFonts w:hint="default" w:ascii="Wingdings" w:hAnsi="Wingdings"/>
         <w:sz w:val="20"/>
       </w:rPr>
     </w:lvl>
@@ -1584,7 +1789,7 @@
         <w:ind w:left="720" w:hanging="360"/>
       </w:pPr>
       <w:rPr>
-        <w:rFonts w:ascii="Symbol" w:hAnsi="Symbol" w:hint="default"/>
+        <w:rFonts w:hint="default" w:ascii="Symbol" w:hAnsi="Symbol"/>
         <w:sz w:val="20"/>
       </w:rPr>
     </w:lvl>
@@ -1600,7 +1805,7 @@
         <w:ind w:left="1440" w:hanging="360"/>
       </w:pPr>
       <w:rPr>
-        <w:rFonts w:ascii="Courier New" w:hAnsi="Courier New" w:hint="default"/>
+        <w:rFonts w:hint="default" w:ascii="Courier New" w:hAnsi="Courier New"/>
         <w:sz w:val="20"/>
       </w:rPr>
     </w:lvl>
@@ -1616,7 +1821,7 @@
         <w:ind w:left="2160" w:hanging="360"/>
       </w:pPr>
       <w:rPr>
-        <w:rFonts w:ascii="Wingdings" w:hAnsi="Wingdings" w:hint="default"/>
+        <w:rFonts w:hint="default" w:ascii="Wingdings" w:hAnsi="Wingdings"/>
         <w:sz w:val="20"/>
       </w:rPr>
     </w:lvl>
@@ -1632,7 +1837,7 @@
         <w:ind w:left="2880" w:hanging="360"/>
       </w:pPr>
       <w:rPr>
-        <w:rFonts w:ascii="Wingdings" w:hAnsi="Wingdings" w:hint="default"/>
+        <w:rFonts w:hint="default" w:ascii="Wingdings" w:hAnsi="Wingdings"/>
         <w:sz w:val="20"/>
       </w:rPr>
     </w:lvl>
@@ -1648,7 +1853,7 @@
         <w:ind w:left="3600" w:hanging="360"/>
       </w:pPr>
       <w:rPr>
-        <w:rFonts w:ascii="Wingdings" w:hAnsi="Wingdings" w:hint="default"/>
+        <w:rFonts w:hint="default" w:ascii="Wingdings" w:hAnsi="Wingdings"/>
         <w:sz w:val="20"/>
       </w:rPr>
     </w:lvl>
@@ -1664,7 +1869,7 @@
         <w:ind w:left="4320" w:hanging="360"/>
       </w:pPr>
       <w:rPr>
-        <w:rFonts w:ascii="Wingdings" w:hAnsi="Wingdings" w:hint="default"/>
+        <w:rFonts w:hint="default" w:ascii="Wingdings" w:hAnsi="Wingdings"/>
         <w:sz w:val="20"/>
       </w:rPr>
     </w:lvl>
@@ -1680,7 +1885,7 @@
         <w:ind w:left="5040" w:hanging="360"/>
       </w:pPr>
       <w:rPr>
-        <w:rFonts w:ascii="Wingdings" w:hAnsi="Wingdings" w:hint="default"/>
+        <w:rFonts w:hint="default" w:ascii="Wingdings" w:hAnsi="Wingdings"/>
         <w:sz w:val="20"/>
       </w:rPr>
     </w:lvl>
@@ -1696,7 +1901,7 @@
         <w:ind w:left="5760" w:hanging="360"/>
       </w:pPr>
       <w:rPr>
-        <w:rFonts w:ascii="Wingdings" w:hAnsi="Wingdings" w:hint="default"/>
+        <w:rFonts w:hint="default" w:ascii="Wingdings" w:hAnsi="Wingdings"/>
         <w:sz w:val="20"/>
       </w:rPr>
     </w:lvl>
@@ -1712,7 +1917,7 @@
         <w:ind w:left="6480" w:hanging="360"/>
       </w:pPr>
       <w:rPr>
-        <w:rFonts w:ascii="Wingdings" w:hAnsi="Wingdings" w:hint="default"/>
+        <w:rFonts w:hint="default" w:ascii="Wingdings" w:hAnsi="Wingdings"/>
         <w:sz w:val="20"/>
       </w:rPr>
     </w:lvl>
@@ -1733,7 +1938,7 @@
         <w:ind w:left="720" w:hanging="360"/>
       </w:pPr>
       <w:rPr>
-        <w:rFonts w:ascii="Symbol" w:hAnsi="Symbol" w:hint="default"/>
+        <w:rFonts w:hint="default" w:ascii="Symbol" w:hAnsi="Symbol"/>
         <w:sz w:val="20"/>
       </w:rPr>
     </w:lvl>
@@ -1749,7 +1954,7 @@
         <w:ind w:left="1440" w:hanging="360"/>
       </w:pPr>
       <w:rPr>
-        <w:rFonts w:ascii="Courier New" w:hAnsi="Courier New" w:hint="default"/>
+        <w:rFonts w:hint="default" w:ascii="Courier New" w:hAnsi="Courier New"/>
         <w:sz w:val="20"/>
       </w:rPr>
     </w:lvl>
@@ -1765,7 +1970,7 @@
         <w:ind w:left="2160" w:hanging="360"/>
       </w:pPr>
       <w:rPr>
-        <w:rFonts w:ascii="Wingdings" w:hAnsi="Wingdings" w:hint="default"/>
+        <w:rFonts w:hint="default" w:ascii="Wingdings" w:hAnsi="Wingdings"/>
         <w:sz w:val="20"/>
       </w:rPr>
     </w:lvl>
@@ -1781,7 +1986,7 @@
         <w:ind w:left="2880" w:hanging="360"/>
       </w:pPr>
       <w:rPr>
-        <w:rFonts w:ascii="Wingdings" w:hAnsi="Wingdings" w:hint="default"/>
+        <w:rFonts w:hint="default" w:ascii="Wingdings" w:hAnsi="Wingdings"/>
         <w:sz w:val="20"/>
       </w:rPr>
     </w:lvl>
@@ -1797,7 +2002,7 @@
         <w:ind w:left="3600" w:hanging="360"/>
       </w:pPr>
       <w:rPr>
-        <w:rFonts w:ascii="Wingdings" w:hAnsi="Wingdings" w:hint="default"/>
+        <w:rFonts w:hint="default" w:ascii="Wingdings" w:hAnsi="Wingdings"/>
         <w:sz w:val="20"/>
       </w:rPr>
     </w:lvl>
@@ -1813,7 +2018,7 @@
         <w:ind w:left="4320" w:hanging="360"/>
       </w:pPr>
       <w:rPr>
-        <w:rFonts w:ascii="Wingdings" w:hAnsi="Wingdings" w:hint="default"/>
+        <w:rFonts w:hint="default" w:ascii="Wingdings" w:hAnsi="Wingdings"/>
         <w:sz w:val="20"/>
       </w:rPr>
     </w:lvl>
@@ -1829,7 +2034,7 @@
         <w:ind w:left="5040" w:hanging="360"/>
       </w:pPr>
       <w:rPr>
-        <w:rFonts w:ascii="Wingdings" w:hAnsi="Wingdings" w:hint="default"/>
+        <w:rFonts w:hint="default" w:ascii="Wingdings" w:hAnsi="Wingdings"/>
         <w:sz w:val="20"/>
       </w:rPr>
     </w:lvl>
@@ -1845,7 +2050,7 @@
         <w:ind w:left="5760" w:hanging="360"/>
       </w:pPr>
       <w:rPr>
-        <w:rFonts w:ascii="Wingdings" w:hAnsi="Wingdings" w:hint="default"/>
+        <w:rFonts w:hint="default" w:ascii="Wingdings" w:hAnsi="Wingdings"/>
         <w:sz w:val="20"/>
       </w:rPr>
     </w:lvl>
@@ -1861,7 +2066,7 @@
         <w:ind w:left="6480" w:hanging="360"/>
       </w:pPr>
       <w:rPr>
-        <w:rFonts w:ascii="Wingdings" w:hAnsi="Wingdings" w:hint="default"/>
+        <w:rFonts w:hint="default" w:ascii="Wingdings" w:hAnsi="Wingdings"/>
         <w:sz w:val="20"/>
       </w:rPr>
     </w:lvl>
@@ -1879,11 +2084,11 @@
 </file>
 
 <file path=word/styles.xml><?xml version="1.0" encoding="utf-8"?>
-<w:styles xmlns:mc="http://schemas.openxmlformats.org/markup-compatibility/2006" xmlns:r="http://schemas.openxmlformats.org/officeDocument/2006/relationships" xmlns:w="http://schemas.openxmlformats.org/wordprocessingml/2006/main" xmlns:w14="http://schemas.microsoft.com/office/word/2010/wordml" xmlns:w15="http://schemas.microsoft.com/office/word/2012/wordml" xmlns:w16cex="http://schemas.microsoft.com/office/word/2018/wordml/cex" xmlns:w16cid="http://schemas.microsoft.com/office/word/2016/wordml/cid" xmlns:w16="http://schemas.microsoft.com/office/word/2018/wordml" xmlns:w16du="http://schemas.microsoft.com/office/word/2023/wordml/word16du" xmlns:w16sdtdh="http://schemas.microsoft.com/office/word/2020/wordml/sdtdatahash" xmlns:w16sdtfl="http://schemas.microsoft.com/office/word/2024/wordml/sdtformatlock" xmlns:w16se="http://schemas.microsoft.com/office/word/2015/wordml/symex" mc:Ignorable="w14 w15 w16se w16cid w16 w16cex w16sdtdh w16sdtfl w16du">
+<w:styles xmlns:wp14="http://schemas.microsoft.com/office/word/2010/wordprocessingDrawing" xmlns:mc="http://schemas.openxmlformats.org/markup-compatibility/2006" xmlns:r="http://schemas.openxmlformats.org/officeDocument/2006/relationships" xmlns:w="http://schemas.openxmlformats.org/wordprocessingml/2006/main" xmlns:w14="http://schemas.microsoft.com/office/word/2010/wordml" xmlns:w15="http://schemas.microsoft.com/office/word/2012/wordml" xmlns:w16cex="http://schemas.microsoft.com/office/word/2018/wordml/cex" xmlns:w16cid="http://schemas.microsoft.com/office/word/2016/wordml/cid" xmlns:w16="http://schemas.microsoft.com/office/word/2018/wordml" xmlns:w16du="http://schemas.microsoft.com/office/word/2023/wordml/word16du" xmlns:w16sdtdh="http://schemas.microsoft.com/office/word/2020/wordml/sdtdatahash" xmlns:w16sdtfl="http://schemas.microsoft.com/office/word/2024/wordml/sdtformatlock" xmlns:w16se="http://schemas.microsoft.com/office/word/2015/wordml/symex" mc:Ignorable="w14 w15 w16se w16cid w16 w16cex w16sdtdh w16sdtfl w16du wp14">
   <w:docDefaults>
     <w:rPrDefault>
       <w:rPr>
-        <w:rFonts w:ascii="Calibri" w:eastAsia="Calibri" w:hAnsi="Calibri" w:cs="Times New Roman"/>
+        <w:rFonts w:ascii="Calibri" w:hAnsi="Calibri" w:eastAsia="Calibri" w:cs="Times New Roman"/>
         <w:lang w:val="pl-PL" w:eastAsia="pl-PL" w:bidi="ar-SA"/>
       </w:rPr>
     </w:rPrDefault>
@@ -1892,14 +2097,14 @@
   <w:latentStyles w:defLockedState="0" w:defUIPriority="99" w:defSemiHidden="0" w:defUnhideWhenUsed="0" w:defQFormat="0" w:count="376">
     <w:lsdException w:name="Normal" w:uiPriority="0" w:qFormat="1"/>
     <w:lsdException w:name="heading 1" w:uiPriority="9" w:qFormat="1"/>
-    <w:lsdException w:name="heading 2" w:semiHidden="1" w:uiPriority="9" w:unhideWhenUsed="1" w:qFormat="1"/>
-    <w:lsdException w:name="heading 3" w:semiHidden="1" w:uiPriority="9" w:unhideWhenUsed="1" w:qFormat="1"/>
-    <w:lsdException w:name="heading 4" w:semiHidden="1" w:uiPriority="9" w:unhideWhenUsed="1" w:qFormat="1"/>
-    <w:lsdException w:name="heading 5" w:semiHidden="1" w:uiPriority="9" w:unhideWhenUsed="1" w:qFormat="1"/>
-    <w:lsdException w:name="heading 6" w:semiHidden="1" w:uiPriority="9" w:unhideWhenUsed="1" w:qFormat="1"/>
-    <w:lsdException w:name="heading 7" w:semiHidden="1" w:uiPriority="9" w:unhideWhenUsed="1" w:qFormat="1"/>
-    <w:lsdException w:name="heading 8" w:semiHidden="1" w:uiPriority="9" w:unhideWhenUsed="1" w:qFormat="1"/>
-    <w:lsdException w:name="heading 9" w:semiHidden="1" w:uiPriority="9" w:unhideWhenUsed="1" w:qFormat="1"/>
+    <w:lsdException w:name="heading 2" w:uiPriority="9" w:semiHidden="1" w:unhideWhenUsed="1" w:qFormat="1"/>
+    <w:lsdException w:name="heading 3" w:uiPriority="9" w:semiHidden="1" w:unhideWhenUsed="1" w:qFormat="1"/>
+    <w:lsdException w:name="heading 4" w:uiPriority="9" w:semiHidden="1" w:unhideWhenUsed="1" w:qFormat="1"/>
+    <w:lsdException w:name="heading 5" w:uiPriority="9" w:semiHidden="1" w:unhideWhenUsed="1" w:qFormat="1"/>
+    <w:lsdException w:name="heading 6" w:uiPriority="9" w:semiHidden="1" w:unhideWhenUsed="1" w:qFormat="1"/>
+    <w:lsdException w:name="heading 7" w:uiPriority="9" w:semiHidden="1" w:unhideWhenUsed="1" w:qFormat="1"/>
+    <w:lsdException w:name="heading 8" w:uiPriority="9" w:semiHidden="1" w:unhideWhenUsed="1" w:qFormat="1"/>
+    <w:lsdException w:name="heading 9" w:uiPriority="9" w:semiHidden="1" w:unhideWhenUsed="1" w:qFormat="1"/>
     <w:lsdException w:name="index 1" w:semiHidden="1" w:unhideWhenUsed="1"/>
     <w:lsdException w:name="index 2" w:semiHidden="1" w:unhideWhenUsed="1"/>
     <w:lsdException w:name="index 3" w:semiHidden="1" w:unhideWhenUsed="1"/>
@@ -1909,22 +2114,22 @@
     <w:lsdException w:name="index 7" w:semiHidden="1" w:unhideWhenUsed="1"/>
     <w:lsdException w:name="index 8" w:semiHidden="1" w:unhideWhenUsed="1"/>
     <w:lsdException w:name="index 9" w:semiHidden="1" w:unhideWhenUsed="1"/>
-    <w:lsdException w:name="toc 1" w:semiHidden="1" w:uiPriority="39" w:unhideWhenUsed="1"/>
-    <w:lsdException w:name="toc 2" w:semiHidden="1" w:uiPriority="39" w:unhideWhenUsed="1"/>
-    <w:lsdException w:name="toc 3" w:semiHidden="1" w:uiPriority="39" w:unhideWhenUsed="1"/>
-    <w:lsdException w:name="toc 4" w:semiHidden="1" w:uiPriority="39" w:unhideWhenUsed="1"/>
-    <w:lsdException w:name="toc 5" w:semiHidden="1" w:uiPriority="39" w:unhideWhenUsed="1"/>
-    <w:lsdException w:name="toc 6" w:semiHidden="1" w:uiPriority="39" w:unhideWhenUsed="1"/>
-    <w:lsdException w:name="toc 7" w:semiHidden="1" w:uiPriority="39" w:unhideWhenUsed="1"/>
-    <w:lsdException w:name="toc 8" w:semiHidden="1" w:uiPriority="39" w:unhideWhenUsed="1"/>
-    <w:lsdException w:name="toc 9" w:semiHidden="1" w:uiPriority="39" w:unhideWhenUsed="1"/>
+    <w:lsdException w:name="toc 1" w:uiPriority="39" w:semiHidden="1" w:unhideWhenUsed="1"/>
+    <w:lsdException w:name="toc 2" w:uiPriority="39" w:semiHidden="1" w:unhideWhenUsed="1"/>
+    <w:lsdException w:name="toc 3" w:uiPriority="39" w:semiHidden="1" w:unhideWhenUsed="1"/>
+    <w:lsdException w:name="toc 4" w:uiPriority="39" w:semiHidden="1" w:unhideWhenUsed="1"/>
+    <w:lsdException w:name="toc 5" w:uiPriority="39" w:semiHidden="1" w:unhideWhenUsed="1"/>
+    <w:lsdException w:name="toc 6" w:uiPriority="39" w:semiHidden="1" w:unhideWhenUsed="1"/>
+    <w:lsdException w:name="toc 7" w:uiPriority="39" w:semiHidden="1" w:unhideWhenUsed="1"/>
+    <w:lsdException w:name="toc 8" w:uiPriority="39" w:semiHidden="1" w:unhideWhenUsed="1"/>
+    <w:lsdException w:name="toc 9" w:uiPriority="39" w:semiHidden="1" w:unhideWhenUsed="1"/>
     <w:lsdException w:name="Normal Indent" w:semiHidden="1" w:unhideWhenUsed="1"/>
     <w:lsdException w:name="footnote text" w:semiHidden="1" w:unhideWhenUsed="1"/>
     <w:lsdException w:name="annotation text" w:semiHidden="1" w:unhideWhenUsed="1"/>
     <w:lsdException w:name="header" w:semiHidden="1" w:unhideWhenUsed="1"/>
     <w:lsdException w:name="footer" w:semiHidden="1" w:unhideWhenUsed="1"/>
     <w:lsdException w:name="index heading" w:semiHidden="1" w:unhideWhenUsed="1"/>
-    <w:lsdException w:name="caption" w:semiHidden="1" w:uiPriority="35" w:unhideWhenUsed="1" w:qFormat="1"/>
+    <w:lsdException w:name="caption" w:uiPriority="35" w:semiHidden="1" w:unhideWhenUsed="1" w:qFormat="1"/>
     <w:lsdException w:name="table of figures" w:semiHidden="1" w:unhideWhenUsed="1"/>
     <w:lsdException w:name="envelope address" w:semiHidden="1" w:unhideWhenUsed="1"/>
     <w:lsdException w:name="envelope return" w:semiHidden="1" w:unhideWhenUsed="1"/>
@@ -1955,7 +2160,7 @@
     <w:lsdException w:name="Title" w:uiPriority="10" w:qFormat="1"/>
     <w:lsdException w:name="Closing" w:semiHidden="1" w:unhideWhenUsed="1"/>
     <w:lsdException w:name="Signature" w:semiHidden="1" w:unhideWhenUsed="1"/>
-    <w:lsdException w:name="Default Paragraph Font" w:semiHidden="1" w:uiPriority="1" w:unhideWhenUsed="1"/>
+    <w:lsdException w:name="Default Paragraph Font" w:uiPriority="1" w:semiHidden="1" w:unhideWhenUsed="1"/>
     <w:lsdException w:name="Body Text" w:semiHidden="1" w:unhideWhenUsed="1"/>
     <w:lsdException w:name="Body Text Indent" w:semiHidden="1" w:unhideWhenUsed="1"/>
     <w:lsdException w:name="List Continue" w:semiHidden="1" w:unhideWhenUsed="1"/>
@@ -2155,8 +2360,8 @@
     <w:lsdException w:name="Subtle Reference" w:uiPriority="31" w:qFormat="1"/>
     <w:lsdException w:name="Intense Reference" w:uiPriority="32" w:qFormat="1"/>
     <w:lsdException w:name="Book Title" w:uiPriority="33" w:qFormat="1"/>
-    <w:lsdException w:name="Bibliography" w:semiHidden="1" w:uiPriority="37" w:unhideWhenUsed="1"/>
-    <w:lsdException w:name="TOC Heading" w:semiHidden="1" w:uiPriority="39" w:unhideWhenUsed="1" w:qFormat="1"/>
+    <w:lsdException w:name="Bibliography" w:uiPriority="37" w:semiHidden="1" w:unhideWhenUsed="1"/>
+    <w:lsdException w:name="TOC Heading" w:uiPriority="39" w:semiHidden="1" w:unhideWhenUsed="1" w:qFormat="1"/>
     <w:lsdException w:name="Plain Table 1" w:uiPriority="41"/>
     <w:lsdException w:name="Plain Table 2" w:uiPriority="42"/>
     <w:lsdException w:name="Plain Table 3" w:uiPriority="43"/>
@@ -2267,7 +2472,7 @@
     <w:lsdException w:name="Unresolved Mention" w:semiHidden="1" w:unhideWhenUsed="1"/>
     <w:lsdException w:name="Smart Link" w:semiHidden="1" w:unhideWhenUsed="1"/>
   </w:latentStyles>
-  <w:style w:type="paragraph" w:default="1" w:styleId="Normalny">
+  <w:style w:type="paragraph" w:styleId="Normalny" w:default="1">
     <w:name w:val="Normal"/>
     <w:qFormat/>
     <w:rsid w:val="00307DD1"/>
@@ -2292,7 +2497,7 @@
       <w:outlineLvl w:val="0"/>
     </w:pPr>
     <w:rPr>
-      <w:rFonts w:ascii="Times New Roman" w:eastAsia="Times New Roman" w:hAnsi="Times New Roman"/>
+      <w:rFonts w:ascii="Times New Roman" w:hAnsi="Times New Roman" w:eastAsia="Times New Roman"/>
       <w:b/>
       <w:bCs/>
       <w:kern w:val="36"/>
@@ -2313,7 +2518,7 @@
       <w:outlineLvl w:val="1"/>
     </w:pPr>
     <w:rPr>
-      <w:rFonts w:ascii="Times New Roman" w:eastAsia="Times New Roman" w:hAnsi="Times New Roman"/>
+      <w:rFonts w:ascii="Times New Roman" w:hAnsi="Times New Roman" w:eastAsia="Times New Roman"/>
       <w:b/>
       <w:bCs/>
       <w:sz w:val="36"/>
@@ -2333,7 +2538,7 @@
       <w:outlineLvl w:val="3"/>
     </w:pPr>
     <w:rPr>
-      <w:rFonts w:ascii="Times New Roman" w:eastAsia="Times New Roman" w:hAnsi="Times New Roman"/>
+      <w:rFonts w:ascii="Times New Roman" w:hAnsi="Times New Roman" w:eastAsia="Times New Roman"/>
       <w:b/>
       <w:bCs/>
       <w:sz w:val="24"/>
@@ -2341,13 +2546,13 @@
       <w:lang w:eastAsia="pl-PL"/>
     </w:rPr>
   </w:style>
-  <w:style w:type="character" w:default="1" w:styleId="Domylnaczcionkaakapitu">
+  <w:style w:type="character" w:styleId="Domylnaczcionkaakapitu" w:default="1">
     <w:name w:val="Default Paragraph Font"/>
     <w:uiPriority w:val="1"/>
     <w:semiHidden/>
     <w:unhideWhenUsed/>
   </w:style>
-  <w:style w:type="table" w:default="1" w:styleId="Standardowy">
+  <w:style w:type="table" w:styleId="Standardowy" w:default="1">
     <w:name w:val="Normal Table"/>
     <w:uiPriority w:val="99"/>
     <w:semiHidden/>
@@ -2363,19 +2568,19 @@
       </w:tblCellMar>
     </w:tblPr>
   </w:style>
-  <w:style w:type="numbering" w:default="1" w:styleId="Bezlisty">
+  <w:style w:type="numbering" w:styleId="Bezlisty" w:default="1">
     <w:name w:val="No List"/>
     <w:uiPriority w:val="99"/>
     <w:semiHidden/>
     <w:unhideWhenUsed/>
   </w:style>
-  <w:style w:type="character" w:customStyle="1" w:styleId="Nagwek1Znak">
+  <w:style w:type="character" w:styleId="Nagwek1Znak" w:customStyle="1">
     <w:name w:val="Nagłówek 1 Znak"/>
     <w:link w:val="Nagwek1"/>
     <w:uiPriority w:val="9"/>
     <w:rsid w:val="002616AD"/>
     <w:rPr>
-      <w:rFonts w:ascii="Times New Roman" w:eastAsia="Times New Roman" w:hAnsi="Times New Roman" w:cs="Times New Roman"/>
+      <w:rFonts w:ascii="Times New Roman" w:hAnsi="Times New Roman" w:eastAsia="Times New Roman" w:cs="Times New Roman"/>
       <w:b/>
       <w:bCs/>
       <w:kern w:val="36"/>
@@ -2384,13 +2589,13 @@
       <w:lang w:eastAsia="pl-PL"/>
     </w:rPr>
   </w:style>
-  <w:style w:type="character" w:customStyle="1" w:styleId="Nagwek2Znak">
+  <w:style w:type="character" w:styleId="Nagwek2Znak" w:customStyle="1">
     <w:name w:val="Nagłówek 2 Znak"/>
     <w:link w:val="Nagwek2"/>
     <w:uiPriority w:val="9"/>
     <w:rsid w:val="002616AD"/>
     <w:rPr>
-      <w:rFonts w:ascii="Times New Roman" w:eastAsia="Times New Roman" w:hAnsi="Times New Roman" w:cs="Times New Roman"/>
+      <w:rFonts w:ascii="Times New Roman" w:hAnsi="Times New Roman" w:eastAsia="Times New Roman" w:cs="Times New Roman"/>
       <w:b/>
       <w:bCs/>
       <w:sz w:val="36"/>
@@ -2398,13 +2603,13 @@
       <w:lang w:eastAsia="pl-PL"/>
     </w:rPr>
   </w:style>
-  <w:style w:type="character" w:customStyle="1" w:styleId="Nagwek4Znak">
+  <w:style w:type="character" w:styleId="Nagwek4Znak" w:customStyle="1">
     <w:name w:val="Nagłówek 4 Znak"/>
     <w:link w:val="Nagwek4"/>
     <w:uiPriority w:val="9"/>
     <w:rsid w:val="002616AD"/>
     <w:rPr>
-      <w:rFonts w:ascii="Times New Roman" w:eastAsia="Times New Roman" w:hAnsi="Times New Roman" w:cs="Times New Roman"/>
+      <w:rFonts w:ascii="Times New Roman" w:hAnsi="Times New Roman" w:eastAsia="Times New Roman" w:cs="Times New Roman"/>
       <w:b/>
       <w:bCs/>
       <w:sz w:val="24"/>
@@ -2435,27 +2640,27 @@
     <w:rsid w:val="002616AD"/>
     <w:pPr>
       <w:pBdr>
-        <w:bottom w:val="single" w:sz="6" w:space="1" w:color="auto"/>
+        <w:bottom w:val="single" w:color="auto" w:sz="6" w:space="1"/>
       </w:pBdr>
       <w:spacing w:after="0" w:line="240" w:lineRule="auto"/>
       <w:jc w:val="center"/>
     </w:pPr>
     <w:rPr>
-      <w:rFonts w:ascii="Arial" w:eastAsia="Times New Roman" w:hAnsi="Arial" w:cs="Arial"/>
+      <w:rFonts w:ascii="Arial" w:hAnsi="Arial" w:eastAsia="Times New Roman" w:cs="Arial"/>
       <w:vanish/>
       <w:sz w:val="16"/>
       <w:szCs w:val="16"/>
       <w:lang w:eastAsia="pl-PL"/>
     </w:rPr>
   </w:style>
-  <w:style w:type="character" w:customStyle="1" w:styleId="ZagicieodgryformularzaZnak">
+  <w:style w:type="character" w:styleId="ZagicieodgryformularzaZnak" w:customStyle="1">
     <w:name w:val="Zagięcie od góry formularza Znak"/>
     <w:link w:val="Zagicieodgryformularza"/>
     <w:uiPriority w:val="99"/>
     <w:semiHidden/>
     <w:rsid w:val="002616AD"/>
     <w:rPr>
-      <w:rFonts w:ascii="Arial" w:eastAsia="Times New Roman" w:hAnsi="Arial" w:cs="Arial"/>
+      <w:rFonts w:ascii="Arial" w:hAnsi="Arial" w:eastAsia="Times New Roman" w:cs="Arial"/>
       <w:vanish/>
       <w:sz w:val="16"/>
       <w:szCs w:val="16"/>
@@ -2474,39 +2679,39 @@
     <w:rsid w:val="002616AD"/>
     <w:pPr>
       <w:pBdr>
-        <w:top w:val="single" w:sz="6" w:space="1" w:color="auto"/>
+        <w:top w:val="single" w:color="auto" w:sz="6" w:space="1"/>
       </w:pBdr>
       <w:spacing w:after="0" w:line="240" w:lineRule="auto"/>
       <w:jc w:val="center"/>
     </w:pPr>
     <w:rPr>
-      <w:rFonts w:ascii="Arial" w:eastAsia="Times New Roman" w:hAnsi="Arial" w:cs="Arial"/>
+      <w:rFonts w:ascii="Arial" w:hAnsi="Arial" w:eastAsia="Times New Roman" w:cs="Arial"/>
       <w:vanish/>
       <w:sz w:val="16"/>
       <w:szCs w:val="16"/>
       <w:lang w:eastAsia="pl-PL"/>
     </w:rPr>
   </w:style>
-  <w:style w:type="character" w:customStyle="1" w:styleId="ZagicieoddouformularzaZnak">
+  <w:style w:type="character" w:styleId="ZagicieoddouformularzaZnak" w:customStyle="1">
     <w:name w:val="Zagięcie od dołu formularza Znak"/>
     <w:link w:val="Zagicieoddouformularza"/>
     <w:uiPriority w:val="99"/>
     <w:semiHidden/>
     <w:rsid w:val="002616AD"/>
     <w:rPr>
-      <w:rFonts w:ascii="Arial" w:eastAsia="Times New Roman" w:hAnsi="Arial" w:cs="Arial"/>
+      <w:rFonts w:ascii="Arial" w:hAnsi="Arial" w:eastAsia="Times New Roman" w:cs="Arial"/>
       <w:vanish/>
       <w:sz w:val="16"/>
       <w:szCs w:val="16"/>
       <w:lang w:eastAsia="pl-PL"/>
     </w:rPr>
   </w:style>
-  <w:style w:type="character" w:customStyle="1" w:styleId="b">
+  <w:style w:type="character" w:styleId="b" w:customStyle="1">
     <w:name w:val="b"/>
     <w:basedOn w:val="Domylnaczcionkaakapitu"/>
     <w:rsid w:val="002616AD"/>
   </w:style>
-  <w:style w:type="character" w:customStyle="1" w:styleId="rss2">
+  <w:style w:type="character" w:styleId="rss2" w:customStyle="1">
     <w:name w:val="rss2"/>
     <w:basedOn w:val="Domylnaczcionkaakapitu"/>
     <w:rsid w:val="002616AD"/>
@@ -2528,7 +2733,7 @@
       <w:szCs w:val="16"/>
     </w:rPr>
   </w:style>
-  <w:style w:type="character" w:customStyle="1" w:styleId="TekstdymkaZnak">
+  <w:style w:type="character" w:styleId="TekstdymkaZnak" w:customStyle="1">
     <w:name w:val="Tekst dymka Znak"/>
     <w:link w:val="Tekstdymka"/>
     <w:uiPriority w:val="99"/>
@@ -2540,11 +2745,37 @@
       <w:szCs w:val="16"/>
     </w:rPr>
   </w:style>
+  <w:style xmlns:w="http://schemas.openxmlformats.org/wordprocessingml/2006/main" w:type="table" w:styleId="TableGrid">
+    <w:name xmlns:w="http://schemas.openxmlformats.org/wordprocessingml/2006/main" w:val="Table Grid"/>
+    <w:basedOn xmlns:w="http://schemas.openxmlformats.org/wordprocessingml/2006/main" w:val="Standardowy"/>
+    <w:uiPriority xmlns:w="http://schemas.openxmlformats.org/wordprocessingml/2006/main" w:val="59"/>
+    <w:rsid xmlns:w="http://schemas.openxmlformats.org/wordprocessingml/2006/main" w:val="00FB4123"/>
+    <w:pPr xmlns:w="http://schemas.openxmlformats.org/wordprocessingml/2006/main">
+      <w:spacing w:after="0" w:line="240" w:lineRule="auto"/>
+    </w:pPr>
+    <w:tblPr xmlns:w="http://schemas.openxmlformats.org/wordprocessingml/2006/main">
+      <w:tblInd w:w="0" w:type="dxa"/>
+      <w:tblBorders>
+        <w:top w:val="single" w:color="000000" w:themeColor="text1" w:sz="4" w:space="0"/>
+        <w:left w:val="single" w:color="000000" w:themeColor="text1" w:sz="4" w:space="0"/>
+        <w:bottom w:val="single" w:color="000000" w:themeColor="text1" w:sz="4" w:space="0"/>
+        <w:right w:val="single" w:color="000000" w:themeColor="text1" w:sz="4" w:space="0"/>
+        <w:insideH w:val="single" w:color="000000" w:themeColor="text1" w:sz="4" w:space="0"/>
+        <w:insideV w:val="single" w:color="000000" w:themeColor="text1" w:sz="4" w:space="0"/>
+      </w:tblBorders>
+      <w:tblCellMar>
+        <w:top w:w="0" w:type="dxa"/>
+        <w:left w:w="108" w:type="dxa"/>
+        <w:bottom w:w="0" w:type="dxa"/>
+        <w:right w:w="108" w:type="dxa"/>
+      </w:tblCellMar>
+    </w:tblPr>
+  </w:style>
 </w:styles>
 </file>
 
 <file path=word/theme/theme1.xml><?xml version="1.0" encoding="utf-8"?>
-<a:theme xmlns:a="http://schemas.openxmlformats.org/drawingml/2006/main" name="Motyw pakietu Office">
+<a:theme xmlns:a="http://schemas.openxmlformats.org/drawingml/2006/main" xmlns:thm15="http://schemas.microsoft.com/office/thememl/2012/main" name="Motyw pakietu Office">
   <a:themeElements>
     <a:clrScheme name="Pakiet Office">
       <a:dk1>

</xml_diff>

<commit_message>
fix: rebuild fuel masters from latest user template
Fixed _2 suffixes for second person, typos (rejetracyjny, ryczalt_do_slownie).

Co-Authored-By: Claude Opus 4.6 (1M context) <noreply@anthropic.com>
</commit_message>
<xml_diff>
--- a/mbr/templates/paliwo_master.docx
+++ b/mbr/templates/paliwo_master.docx
@@ -1958,887 +1958,6 @@
         <w:br w:type="column"/>
       </w:r>
     </w:p>
-    <w:p>
-      <w:pPr>
-        <w:spacing w:after="0" w:line="240" w:lineRule="auto"/>
-        <w:jc w:val="left"/>
-        <w:rPr>
-          <w:rFonts w:ascii="Times New Roman" w:hAnsi="Times New Roman" w:eastAsia="Times New Roman"/>
-          <w:color w:val="0E0E0E"/>
-          <w:sz w:val="24"/>
-          <w:szCs w:val="24"/>
-          <w:lang w:eastAsia="pl-PL"/>
-        </w:rPr>
-      </w:pPr>
-      <w:r>
-        <w:rPr>
-          <w:rFonts w:ascii="Times New Roman" w:hAnsi="Times New Roman" w:eastAsia="Times New Roman"/>
-          <w:color w:val="0E0E0E"/>
-          <w:sz w:val="24"/>
-          <w:szCs w:val="24"/>
-          <w:lang w:eastAsia="pl-PL"/>
-        </w:rPr>
-        <w:t xml:space="preserve">   {{imie_nazwisko}}                                {{data_wystawienia}}</w:t>
-      </w:r>
-    </w:p>
-    <w:p>
-      <w:pPr>
-        <w:spacing w:after="0" w:line="240" w:lineRule="auto"/>
-        <w:rPr>
-          <w:rFonts w:ascii="Times New Roman" w:hAnsi="Times New Roman" w:eastAsia="Times New Roman"/>
-          <w:color w:val="0E0E0E"/>
-          <w:sz w:val="16"/>
-          <w:szCs w:val="16"/>
-          <w:lang w:eastAsia="pl-PL"/>
-        </w:rPr>
-      </w:pPr>
-      <w:r>
-        <w:rPr>
-          <w:rFonts w:ascii="Times New Roman" w:hAnsi="Times New Roman" w:eastAsia="Times New Roman"/>
-          <w:color w:val="0E0E0E"/>
-          <w:sz w:val="16"/>
-          <w:szCs w:val="16"/>
-          <w:lang w:eastAsia="pl-PL"/>
-        </w:rPr>
-        <w:t xml:space="preserve">               (imię i nazwisko)</w:t>
-      </w:r>
-      <w:r>
-        <w:tab/>
-      </w:r>
-      <w:r>
-        <w:tab/>
-      </w:r>
-      <w:r>
-        <w:tab/>
-      </w:r>
-      <w:r>
-        <w:tab/>
-      </w:r>
-      <w:r>
-        <w:tab/>
-      </w:r>
-      <w:r>
-        <w:rPr>
-          <w:rFonts w:ascii="Times New Roman" w:hAnsi="Times New Roman" w:eastAsia="Times New Roman"/>
-          <w:color w:val="0E0E0E"/>
-          <w:sz w:val="16"/>
-          <w:szCs w:val="16"/>
-          <w:lang w:eastAsia="pl-PL"/>
-        </w:rPr>
-        <w:t>(data)</w:t>
-      </w:r>
-    </w:p>
-    <w:p>
-      <w:pPr>
-        <w:spacing w:before="240" w:after="0" w:line="240" w:lineRule="auto"/>
-        <w:rPr>
-          <w:rFonts w:ascii="Times New Roman" w:hAnsi="Times New Roman" w:eastAsia="Times New Roman"/>
-          <w:color w:val="0E0E0E"/>
-          <w:sz w:val="24"/>
-          <w:szCs w:val="24"/>
-          <w:lang w:eastAsia="pl-PL"/>
-        </w:rPr>
-      </w:pPr>
-      <w:r>
-        <w:rPr>
-          <w:rFonts w:ascii="Times New Roman" w:hAnsi="Times New Roman" w:eastAsia="Times New Roman"/>
-          <w:color w:val="0E0E0E"/>
-          <w:sz w:val="24"/>
-          <w:szCs w:val="24"/>
-          <w:lang w:eastAsia="pl-PL"/>
-        </w:rPr>
-        <w:t xml:space="preserve">   {{stanowisko}}</w:t>
-      </w:r>
-    </w:p>
-    <w:p>
-      <w:pPr>
-        <w:spacing w:after="0" w:line="240" w:lineRule="auto"/>
-        <w:rPr>
-          <w:rFonts w:ascii="Times New Roman" w:hAnsi="Times New Roman" w:eastAsia="Times New Roman"/>
-          <w:color w:val="0E0E0E"/>
-          <w:sz w:val="16"/>
-          <w:szCs w:val="16"/>
-          <w:lang w:eastAsia="pl-PL"/>
-        </w:rPr>
-      </w:pPr>
-      <w:r>
-        <w:rPr>
-          <w:rFonts w:ascii="Times New Roman" w:hAnsi="Times New Roman" w:eastAsia="Times New Roman"/>
-          <w:color w:val="0E0E0E"/>
-          <w:sz w:val="16"/>
-          <w:szCs w:val="16"/>
-          <w:lang w:eastAsia="pl-PL"/>
-        </w:rPr>
-        <w:t xml:space="preserve">       (stanowisko służbowe)</w:t>
-      </w:r>
-    </w:p>
-    <w:p>
-      <w:pPr>
-        <w:spacing w:after="0" w:line="240" w:lineRule="auto"/>
-        <w:rPr>
-          <w:rFonts w:ascii="Times New Roman" w:hAnsi="Times New Roman" w:eastAsia="Times New Roman"/>
-          <w:color w:val="0E0E0E"/>
-          <w:sz w:val="24"/>
-          <w:szCs w:val="24"/>
-          <w:lang w:eastAsia="pl-PL"/>
-        </w:rPr>
-      </w:pPr>
-    </w:p>
-    <w:p>
-      <w:pPr>
-        <w:spacing w:after="0" w:line="240" w:lineRule="auto"/>
-        <w:jc w:val="center"/>
-        <w:rPr>
-          <w:rFonts w:ascii="Times New Roman" w:hAnsi="Times New Roman" w:eastAsia="Times New Roman"/>
-          <w:color w:val="0E0E0E"/>
-          <w:sz w:val="32"/>
-          <w:szCs w:val="32"/>
-          <w:lang w:eastAsia="pl-PL"/>
-        </w:rPr>
-      </w:pPr>
-      <w:r>
-        <w:rPr>
-          <w:rFonts w:ascii="Times New Roman" w:hAnsi="Times New Roman" w:eastAsia="Times New Roman"/>
-          <w:b w:val="1"/>
-          <w:bCs w:val="1"/>
-          <w:sz w:val="32"/>
-          <w:szCs w:val="32"/>
-          <w:lang w:eastAsia="pl-PL"/>
-        </w:rPr>
-        <w:t xml:space="preserve">OŚWIADCZENIE </w:t>
-      </w:r>
-    </w:p>
-    <w:p>
-      <w:pPr>
-        <w:spacing w:after="0" w:line="240" w:lineRule="auto"/>
-        <w:rPr>
-          <w:rFonts w:ascii="Times New Roman" w:hAnsi="Times New Roman" w:eastAsia="Times New Roman"/>
-          <w:color w:val="0E0E0E"/>
-          <w:sz w:val="24"/>
-          <w:szCs w:val="24"/>
-          <w:lang w:eastAsia="pl-PL"/>
-        </w:rPr>
-      </w:pPr>
-    </w:p>
-    <w:p>
-      <w:pPr>
-        <w:spacing w:after="160" w:line="240" w:lineRule="auto"/>
-        <w:jc w:val="right"/>
-        <w:rPr>
-          <w:rFonts w:ascii="Times New Roman" w:hAnsi="Times New Roman" w:eastAsia="Times New Roman"/>
-          <w:b w:val="1"/>
-          <w:bCs w:val="1"/>
-          <w:color w:val="0E0E0E"/>
-          <w:lang w:eastAsia="pl-PL"/>
-        </w:rPr>
-      </w:pPr>
-      <w:r>
-        <w:rPr>
-          <w:rFonts w:ascii="Times New Roman" w:hAnsi="Times New Roman" w:eastAsia="Times New Roman"/>
-          <w:b w:val="1"/>
-          <w:bCs w:val="1"/>
-          <w:color w:val="0E0E0E"/>
-          <w:lang w:eastAsia="pl-PL"/>
-        </w:rPr>
-        <w:t xml:space="preserve">o używaniu własnego samochodu nr rej.: </w:t>
-      </w:r>
-      <w:r>
-        <w:tab/>
-      </w:r>
-      <w:r>
-        <w:tab/>
-      </w:r>
-      <w:r>
-        <w:rPr>
-          <w:rFonts w:ascii="Times New Roman" w:hAnsi="Times New Roman" w:eastAsia="Times New Roman"/>
-          <w:b w:val="1"/>
-          <w:bCs w:val="1"/>
-          <w:color w:val="0E0E0E"/>
-          <w:lang w:eastAsia="pl-PL"/>
-        </w:rPr>
-        <w:t xml:space="preserve"> {{nr_rejestracyjny}}</w:t>
-      </w:r>
-    </w:p>
-    <w:p>
-      <w:pPr>
-        <w:spacing w:after="0" w:line="240" w:lineRule="auto"/>
-        <w:ind w:left="2126"/>
-        <w:jc w:val="right"/>
-        <w:rPr>
-          <w:rFonts w:ascii="Times New Roman" w:hAnsi="Times New Roman" w:eastAsia="Times New Roman"/>
-          <w:color w:val="0E0E0E"/>
-          <w:sz w:val="24"/>
-          <w:szCs w:val="24"/>
-          <w:lang w:eastAsia="pl-PL"/>
-        </w:rPr>
-      </w:pPr>
-      <w:r>
-        <w:rPr>
-          <w:rFonts w:ascii="Times New Roman" w:hAnsi="Times New Roman" w:eastAsia="Times New Roman"/>
-          <w:color w:val="0E0E0E"/>
-          <w:sz w:val="24"/>
-          <w:szCs w:val="24"/>
-          <w:lang w:eastAsia="pl-PL"/>
-        </w:rPr>
-        <w:t xml:space="preserve">           </w:t>
-      </w:r>
-      <w:r>
-        <w:rPr>
-          <w:rFonts w:ascii="Times New Roman" w:hAnsi="Times New Roman" w:eastAsia="Times New Roman"/>
-          <w:b w:val="1"/>
-          <w:bCs w:val="1"/>
-          <w:color w:val="0E0E0E"/>
-          <w:lang w:eastAsia="pl-PL"/>
-        </w:rPr>
-        <w:t>w miesiącu</w:t>
-      </w:r>
-      <w:r>
-        <w:rPr>
-          <w:rFonts w:ascii="Times New Roman" w:hAnsi="Times New Roman" w:eastAsia="Times New Roman"/>
-          <w:color w:val="0E0E0E"/>
-          <w:sz w:val="24"/>
-          <w:szCs w:val="24"/>
-          <w:lang w:eastAsia="pl-PL"/>
-        </w:rPr>
-        <w:t>:                              {{miesiac}}</w:t>
-      </w:r>
-    </w:p>
-    <w:p>
-      <w:pPr>
-        <w:spacing w:after="0" w:line="240" w:lineRule="auto"/>
-        <w:ind w:left="2124"/>
-        <w:jc w:val="right"/>
-        <w:rPr>
-          <w:rFonts w:ascii="Times New Roman" w:hAnsi="Times New Roman" w:eastAsia="Times New Roman"/>
-          <w:color w:val="0E0E0E"/>
-          <w:sz w:val="24"/>
-          <w:szCs w:val="24"/>
-          <w:lang w:eastAsia="pl-PL"/>
-        </w:rPr>
-      </w:pPr>
-    </w:p>
-    <w:p>
-      <w:pPr>
-        <w:spacing w:after="0" w:line="240" w:lineRule="auto"/>
-        <w:ind w:firstLine="284"/>
-        <w:jc w:val="right"/>
-        <w:rPr>
-          <w:rFonts w:ascii="Times New Roman" w:hAnsi="Times New Roman" w:eastAsia="Times New Roman"/>
-          <w:color w:val="0E0E0E"/>
-          <w:sz w:val="20"/>
-          <w:szCs w:val="20"/>
-          <w:lang w:eastAsia="pl-PL"/>
-        </w:rPr>
-      </w:pPr>
-      <w:r>
-        <w:rPr>
-          <w:rFonts w:ascii="Times New Roman" w:hAnsi="Times New Roman" w:eastAsia="Times New Roman"/>
-          <w:color w:val="0E0E0E"/>
-          <w:sz w:val="20"/>
-          <w:szCs w:val="20"/>
-          <w:lang w:eastAsia="pl-PL"/>
-        </w:rPr>
-        <w:t>Oświadczam, że w oparciu o przyznany mi ryczałt za m-c:   {{miesiac_ryczalt}}</w:t>
-      </w:r>
-    </w:p>
-    <w:p>
-      <w:pPr>
-        <w:spacing w:after="0" w:line="240" w:lineRule="auto"/>
-        <w:rPr>
-          <w:rFonts w:ascii="Times New Roman" w:hAnsi="Times New Roman" w:eastAsia="Times New Roman"/>
-          <w:color w:val="0E0E0E"/>
-          <w:sz w:val="20"/>
-          <w:szCs w:val="20"/>
-          <w:lang w:eastAsia="pl-PL"/>
-        </w:rPr>
-      </w:pPr>
-      <w:r>
-        <w:rPr>
-          <w:rFonts w:ascii="Times New Roman" w:hAnsi="Times New Roman" w:eastAsia="Times New Roman"/>
-          <w:color w:val="0E0E0E"/>
-          <w:sz w:val="20"/>
-          <w:szCs w:val="20"/>
-          <w:lang w:eastAsia="pl-PL"/>
-        </w:rPr>
-        <w:t>na {{limit_km}} km. używałem samochód prywatny do celów służbowych.</w:t>
-      </w:r>
-    </w:p>
-    <w:p>
-      <w:pPr>
-        <w:spacing w:after="0" w:line="240" w:lineRule="auto"/>
-        <w:ind w:left="1416" w:firstLine="0"/>
-        <w:jc w:val="right"/>
-        <w:rPr>
-          <w:rFonts w:ascii="Times New Roman" w:hAnsi="Times New Roman" w:eastAsia="Times New Roman"/>
-          <w:color w:val="0E0E0E"/>
-          <w:sz w:val="20"/>
-          <w:szCs w:val="20"/>
-          <w:lang w:eastAsia="pl-PL"/>
-        </w:rPr>
-      </w:pPr>
-      <w:r>
-        <w:rPr>
-          <w:rFonts w:ascii="Times New Roman" w:hAnsi="Times New Roman" w:eastAsia="Times New Roman"/>
-          <w:color w:val="0E0E0E"/>
-          <w:sz w:val="20"/>
-          <w:szCs w:val="20"/>
-          <w:lang w:eastAsia="pl-PL"/>
-        </w:rPr>
-        <w:t>Ryczałt wykorzystałem w kwocie:                             {{ryczalt}} zł</w:t>
-      </w:r>
-    </w:p>
-    <w:p>
-      <w:pPr>
-        <w:spacing w:before="240" w:after="240" w:line="240" w:lineRule="auto"/>
-        <w:rPr>
-          <w:rFonts w:ascii="Times New Roman" w:hAnsi="Times New Roman" w:eastAsia="Times New Roman"/>
-          <w:b w:val="1"/>
-          <w:bCs w:val="1"/>
-          <w:color w:val="0E0E0E"/>
-          <w:sz w:val="24"/>
-          <w:szCs w:val="24"/>
-          <w:lang w:eastAsia="pl-PL"/>
-        </w:rPr>
-      </w:pPr>
-      <w:r>
-        <w:rPr>
-          <w:rFonts w:ascii="Times New Roman" w:hAnsi="Times New Roman" w:eastAsia="Times New Roman"/>
-          <w:b w:val="1"/>
-          <w:bCs w:val="1"/>
-          <w:color w:val="0E0E0E"/>
-          <w:sz w:val="24"/>
-          <w:szCs w:val="24"/>
-          <w:lang w:eastAsia="pl-PL"/>
-        </w:rPr>
-        <w:t>Potrącenia:</w:t>
-      </w:r>
-    </w:p>
-    <w:p>
-      <w:pPr>
-        <w:spacing w:after="120" w:line="240" w:lineRule="auto"/>
-        <w:rPr>
-          <w:rFonts w:ascii="Times New Roman" w:hAnsi="Times New Roman" w:eastAsia="Times New Roman"/>
-          <w:color w:val="0E0E0E"/>
-          <w:sz w:val="18"/>
-          <w:szCs w:val="18"/>
-          <w:lang w:eastAsia="pl-PL"/>
-        </w:rPr>
-      </w:pPr>
-      <w:r>
-        <w:rPr>
-          <w:rFonts w:ascii="Times New Roman" w:hAnsi="Times New Roman" w:eastAsia="Times New Roman"/>
-          <w:color w:val="0E0E0E"/>
-          <w:sz w:val="18"/>
-          <w:szCs w:val="18"/>
-          <w:lang w:eastAsia="pl-PL"/>
-        </w:rPr>
-        <w:t>Za {{dni_urlopu}} dni urlopu wypoczynkowego (okolicznościowego,</w:t>
-      </w:r>
-      <w:r>
-        <w:br/>
-      </w:r>
-      <w:r>
-        <w:rPr>
-          <w:rFonts w:ascii="Times New Roman" w:hAnsi="Times New Roman" w:eastAsia="Times New Roman"/>
-          <w:color w:val="0E0E0E"/>
-          <w:sz w:val="18"/>
-          <w:szCs w:val="18"/>
-          <w:lang w:eastAsia="pl-PL"/>
-        </w:rPr>
-        <w:t>bezpłatnego), delegacji służbowej, z powodu choroby.</w:t>
-      </w:r>
-    </w:p>
-    <w:p>
-      <w:pPr>
-        <w:spacing w:after="0" w:line="360" w:lineRule="auto"/>
-        <w:ind w:firstLine="570"/>
-        <w:jc w:val="right"/>
-        <w:rPr>
-          <w:rFonts w:ascii="Times New Roman" w:hAnsi="Times New Roman" w:eastAsia="Times New Roman"/>
-          <w:color w:val="0E0E0E"/>
-          <w:sz w:val="20"/>
-          <w:szCs w:val="20"/>
-          <w:lang w:eastAsia="pl-PL"/>
-        </w:rPr>
-      </w:pPr>
-      <w:r>
-        <w:rPr>
-          <w:rFonts w:ascii="Times New Roman" w:hAnsi="Times New Roman" w:eastAsia="Times New Roman"/>
-          <w:color w:val="0E0E0E"/>
-          <w:sz w:val="18"/>
-          <w:szCs w:val="18"/>
-          <w:lang w:eastAsia="pl-PL"/>
-        </w:rPr>
-        <w:t>o 1/22 za każdy dzień j.w. po zł</w:t>
-      </w:r>
-      <w:r>
-        <w:rPr>
-          <w:rFonts w:ascii="Times New Roman" w:hAnsi="Times New Roman" w:eastAsia="Times New Roman"/>
-          <w:color w:val="0E0E0E"/>
-          <w:sz w:val="20"/>
-          <w:szCs w:val="20"/>
-          <w:lang w:eastAsia="pl-PL"/>
-        </w:rPr>
-        <w:t>.:                            {{stawka_dzienna}} zł</w:t>
-      </w:r>
-    </w:p>
-    <w:p>
-      <w:pPr>
-        <w:spacing w:before="120" w:after="0" w:line="360" w:lineRule="auto"/>
-        <w:jc w:val="right"/>
-        <w:rPr>
-          <w:rFonts w:ascii="Times New Roman" w:hAnsi="Times New Roman" w:eastAsia="Times New Roman"/>
-          <w:color w:val="0E0E0E"/>
-          <w:sz w:val="20"/>
-          <w:szCs w:val="20"/>
-          <w:lang w:eastAsia="pl-PL"/>
-        </w:rPr>
-      </w:pPr>
-      <w:r>
-        <w:rPr>
-          <w:rFonts w:ascii="Times New Roman" w:hAnsi="Times New Roman" w:eastAsia="Times New Roman"/>
-          <w:b w:val="1"/>
-          <w:bCs w:val="1"/>
-          <w:color w:val="0E0E0E"/>
-          <w:sz w:val="20"/>
-          <w:szCs w:val="20"/>
-          <w:lang w:eastAsia="pl-PL"/>
-        </w:rPr>
-        <w:t>RAZEM:</w:t>
-      </w:r>
-      <w:r>
-        <w:rPr>
-          <w:rFonts w:ascii="Times New Roman" w:hAnsi="Times New Roman" w:eastAsia="Times New Roman"/>
-          <w:color w:val="0E0E0E"/>
-          <w:sz w:val="20"/>
-          <w:szCs w:val="20"/>
-          <w:lang w:eastAsia="pl-PL"/>
-        </w:rPr>
-        <w:t xml:space="preserve"> {{potracenie}} zł</w:t>
-      </w:r>
-    </w:p>
-    <w:p>
-      <w:pPr>
-        <w:pStyle w:val="Normalny"/>
-        <w:suppressLineNumbers w:val="0"/>
-        <w:bidi w:val="0"/>
-        <w:spacing w:before="0" w:beforeAutospacing="off" w:after="0" w:afterAutospacing="off" w:line="360" w:lineRule="auto"/>
-        <w:ind w:left="0" w:right="0"/>
-        <w:jc w:val="right"/>
-        <w:rPr>
-          <w:rFonts w:ascii="Times New Roman" w:hAnsi="Times New Roman" w:eastAsia="Times New Roman"/>
-          <w:b w:val="1"/>
-          <w:bCs w:val="1"/>
-          <w:color w:val="0E0E0E"/>
-          <w:sz w:val="20"/>
-          <w:szCs w:val="20"/>
-          <w:lang w:eastAsia="pl-PL"/>
-        </w:rPr>
-      </w:pPr>
-      <w:r>
-        <w:rPr>
-          <w:rFonts w:ascii="Times New Roman" w:hAnsi="Times New Roman" w:eastAsia="Times New Roman"/>
-          <w:b w:val="1"/>
-          <w:bCs w:val="1"/>
-          <w:color w:val="0E0E0E"/>
-          <w:sz w:val="20"/>
-          <w:szCs w:val="20"/>
-          <w:lang w:eastAsia="pl-PL"/>
-        </w:rPr>
-        <w:t>RYCZAŁT DO WYPŁATY:                     {{ryczalt_do_wyplaty}} zł</w:t>
-      </w:r>
-    </w:p>
-    <w:p>
-      <w:pPr>
-        <w:pStyle w:val="Normalny"/>
-        <w:spacing w:after="120" w:line="360" w:lineRule="auto"/>
-        <w:jc w:val="right"/>
-        <w:rPr>
-          <w:rFonts w:ascii="Times New Roman" w:hAnsi="Times New Roman" w:eastAsia="Times New Roman"/>
-          <w:b w:val="1"/>
-          <w:bCs w:val="1"/>
-          <w:color w:val="0E0E0E"/>
-          <w:sz w:val="20"/>
-          <w:szCs w:val="20"/>
-          <w:lang w:eastAsia="pl-PL"/>
-        </w:rPr>
-      </w:pPr>
-      <w:r>
-        <w:rPr>
-          <w:rFonts w:ascii="Times New Roman" w:hAnsi="Times New Roman" w:eastAsia="Times New Roman"/>
-          <w:b w:val="1"/>
-          <w:bCs w:val="1"/>
-          <w:color w:val="0E0E0E"/>
-          <w:sz w:val="20"/>
-          <w:szCs w:val="20"/>
-          <w:lang w:eastAsia="pl-PL"/>
-        </w:rPr>
-        <w:t>Proszę o wypłacenie należności:</w:t>
-      </w:r>
-      <w:r>
-        <w:rPr>
-          <w:rFonts w:ascii="Times New Roman" w:hAnsi="Times New Roman" w:eastAsia="Times New Roman"/>
-          <w:color w:val="0E0E0E"/>
-          <w:sz w:val="20"/>
-          <w:szCs w:val="20"/>
-          <w:lang w:eastAsia="pl-PL"/>
-        </w:rPr>
-        <w:t xml:space="preserve">                     </w:t>
-      </w:r>
-      <w:r>
-        <w:rPr>
-          <w:rFonts w:ascii="Times New Roman" w:hAnsi="Times New Roman" w:eastAsia="Times New Roman"/>
-          <w:b w:val="1"/>
-          <w:bCs w:val="1"/>
-          <w:color w:val="0E0E0E"/>
-          <w:sz w:val="20"/>
-          <w:szCs w:val="20"/>
-          <w:lang w:eastAsia="pl-PL"/>
-        </w:rPr>
-        <w:t>{{ryczalt_do_wyplaty}} zł</w:t>
-      </w:r>
-    </w:p>
-    <w:p>
-      <w:pPr>
-        <w:pStyle w:val="Normalny"/>
-        <w:spacing w:after="120" w:line="240" w:lineRule="auto"/>
-        <w:jc w:val="right"/>
-        <w:rPr>
-          <w:rFonts w:ascii="Times New Roman" w:hAnsi="Times New Roman" w:eastAsia="Times New Roman"/>
-          <w:b w:val="1"/>
-          <w:bCs w:val="1"/>
-          <w:color w:val="0E0E0E"/>
-          <w:sz w:val="20"/>
-          <w:szCs w:val="20"/>
-          <w:lang w:eastAsia="pl-PL"/>
-        </w:rPr>
-      </w:pPr>
-      <w:r>
-        <w:rPr>
-          <w:rFonts w:ascii="Times New Roman" w:hAnsi="Times New Roman" w:eastAsia="Times New Roman"/>
-          <w:color w:val="0E0E0E"/>
-          <w:sz w:val="18"/>
-          <w:szCs w:val="18"/>
-          <w:lang w:eastAsia="pl-PL"/>
-        </w:rPr>
-        <w:t xml:space="preserve">Kwituję odbiór kwoty:                        </w:t>
-      </w:r>
-      <w:r>
-        <w:rPr>
-          <w:rFonts w:ascii="Times New Roman" w:hAnsi="Times New Roman" w:eastAsia="Times New Roman"/>
-          <w:b w:val="1"/>
-          <w:bCs w:val="1"/>
-          <w:color w:val="0E0E0E"/>
-          <w:sz w:val="20"/>
-          <w:szCs w:val="20"/>
-          <w:lang w:eastAsia="pl-PL"/>
-        </w:rPr>
-        <w:t>{{ryczalt_do_wyplaty}} zł</w:t>
-      </w:r>
-    </w:p>
-    <w:p>
-      <w:pPr>
-        <w:pStyle w:val="Normalny"/>
-        <w:spacing w:after="120" w:line="240" w:lineRule="auto"/>
-        <w:jc w:val="right"/>
-        <w:rPr>
-          <w:rFonts w:ascii="Times New Roman" w:hAnsi="Times New Roman" w:eastAsia="Times New Roman"/>
-          <w:b w:val="1"/>
-          <w:bCs w:val="1"/>
-          <w:color w:val="0E0E0E"/>
-          <w:sz w:val="20"/>
-          <w:szCs w:val="20"/>
-          <w:lang w:eastAsia="pl-PL"/>
-        </w:rPr>
-      </w:pPr>
-      <w:r>
-        <w:rPr>
-          <w:rFonts w:ascii="Times New Roman" w:hAnsi="Times New Roman" w:eastAsia="Times New Roman"/>
-          <w:color w:val="0E0E0E"/>
-          <w:sz w:val="18"/>
-          <w:szCs w:val="18"/>
-          <w:lang w:eastAsia="pl-PL"/>
-        </w:rPr>
-        <w:t xml:space="preserve">Słownie:                           </w:t>
-      </w:r>
-      <w:r>
-        <w:rPr>
-          <w:rFonts w:ascii="Times New Roman" w:hAnsi="Times New Roman" w:eastAsia="Times New Roman"/>
-          <w:b w:val="1"/>
-          <w:bCs w:val="1"/>
-          <w:color w:val="0E0E0E"/>
-          <w:sz w:val="20"/>
-          <w:szCs w:val="20"/>
-          <w:lang w:eastAsia="pl-PL"/>
-        </w:rPr>
-        <w:t xml:space="preserve"> {{kwota_slownie}} </w:t>
-      </w:r>
-    </w:p>
-    <w:p>
-      <w:pPr>
-        <w:spacing w:after="0" w:line="240" w:lineRule="auto"/>
-        <w:rPr>
-          <w:rFonts w:ascii="Times New Roman" w:hAnsi="Times New Roman" w:eastAsia="Times New Roman"/>
-          <w:color w:val="0E0E0E"/>
-          <w:sz w:val="18"/>
-          <w:szCs w:val="18"/>
-          <w:lang w:eastAsia="pl-PL"/>
-        </w:rPr>
-      </w:pPr>
-    </w:p>
-    <w:p>
-      <w:pPr>
-        <w:spacing w:after="0" w:line="240" w:lineRule="auto"/>
-        <w:rPr>
-          <w:rFonts w:ascii="Times New Roman" w:hAnsi="Times New Roman" w:eastAsia="Times New Roman"/>
-          <w:color w:val="0E0E0E"/>
-          <w:sz w:val="18"/>
-          <w:szCs w:val="18"/>
-          <w:lang w:eastAsia="pl-PL"/>
-        </w:rPr>
-      </w:pPr>
-    </w:p>
-    <w:p>
-      <w:pPr>
-        <w:spacing w:after="0" w:line="240" w:lineRule="auto"/>
-        <w:rPr>
-          <w:rFonts w:ascii="Times New Roman" w:hAnsi="Times New Roman" w:eastAsia="Times New Roman"/>
-          <w:color w:val="0E0E0E"/>
-          <w:sz w:val="18"/>
-          <w:szCs w:val="18"/>
-          <w:lang w:eastAsia="pl-PL"/>
-        </w:rPr>
-      </w:pPr>
-      <w:r>
-        <w:rPr>
-          <w:rFonts w:ascii="Times New Roman" w:hAnsi="Times New Roman" w:eastAsia="Times New Roman"/>
-          <w:color w:val="0E0E0E"/>
-          <w:sz w:val="18"/>
-          <w:szCs w:val="18"/>
-          <w:lang w:eastAsia="pl-PL"/>
-        </w:rPr>
-        <w:t>……………………………….</w:t>
-      </w:r>
-    </w:p>
-    <w:p>
-      <w:pPr>
-        <w:spacing w:after="0" w:line="240" w:lineRule="auto"/>
-        <w:rPr>
-          <w:rFonts w:ascii="Times New Roman" w:hAnsi="Times New Roman" w:eastAsia="Times New Roman"/>
-          <w:color w:val="0E0E0E"/>
-          <w:sz w:val="16"/>
-          <w:szCs w:val="16"/>
-          <w:lang w:eastAsia="pl-PL"/>
-        </w:rPr>
-      </w:pPr>
-      <w:r>
-        <w:rPr>
-          <w:rFonts w:ascii="Times New Roman" w:hAnsi="Times New Roman" w:eastAsia="Times New Roman"/>
-          <w:color w:val="0E0E0E"/>
-          <w:sz w:val="16"/>
-          <w:szCs w:val="16"/>
-          <w:lang w:eastAsia="pl-PL"/>
-        </w:rPr>
-        <w:t xml:space="preserve">          (podpis rozliczającego)</w:t>
-      </w:r>
-    </w:p>
-    <w:p>
-      <w:pPr>
-        <w:spacing w:after="0" w:line="240" w:lineRule="auto"/>
-        <w:rPr>
-          <w:rFonts w:ascii="Times New Roman" w:hAnsi="Times New Roman" w:eastAsia="Times New Roman"/>
-          <w:color w:val="0E0E0E"/>
-          <w:sz w:val="16"/>
-          <w:szCs w:val="16"/>
-          <w:lang w:eastAsia="pl-PL"/>
-        </w:rPr>
-      </w:pPr>
-    </w:p>
-    <w:p>
-      <w:pPr>
-        <w:spacing w:after="0" w:line="240" w:lineRule="auto"/>
-        <w:rPr>
-          <w:rFonts w:ascii="Times New Roman" w:hAnsi="Times New Roman" w:eastAsia="Times New Roman"/>
-          <w:color w:val="0E0E0E"/>
-          <w:sz w:val="16"/>
-          <w:szCs w:val="16"/>
-          <w:lang w:eastAsia="pl-PL"/>
-        </w:rPr>
-      </w:pPr>
-    </w:p>
-    <w:p>
-      <w:pPr>
-        <w:spacing w:after="0" w:line="240" w:lineRule="auto"/>
-        <w:rPr>
-          <w:rFonts w:ascii="Times New Roman" w:hAnsi="Times New Roman" w:eastAsia="Times New Roman"/>
-          <w:color w:val="0E0E0E"/>
-          <w:sz w:val="16"/>
-          <w:szCs w:val="16"/>
-          <w:lang w:eastAsia="pl-PL"/>
-        </w:rPr>
-      </w:pPr>
-    </w:p>
-    <w:p>
-      <w:pPr>
-        <w:spacing w:after="0" w:line="240" w:lineRule="auto"/>
-        <w:rPr>
-          <w:rFonts w:ascii="Times New Roman" w:hAnsi="Times New Roman" w:eastAsia="Times New Roman"/>
-          <w:color w:val="0E0E0E"/>
-          <w:sz w:val="16"/>
-          <w:szCs w:val="16"/>
-          <w:lang w:eastAsia="pl-PL"/>
-        </w:rPr>
-      </w:pPr>
-    </w:p>
-    <w:p>
-      <w:pPr>
-        <w:spacing w:after="0" w:line="240" w:lineRule="auto"/>
-        <w:rPr>
-          <w:rFonts w:ascii="Times New Roman" w:hAnsi="Times New Roman" w:eastAsia="Times New Roman"/>
-          <w:color w:val="0E0E0E"/>
-          <w:sz w:val="16"/>
-          <w:szCs w:val="16"/>
-          <w:lang w:eastAsia="pl-PL"/>
-        </w:rPr>
-      </w:pPr>
-    </w:p>
-    <w:p>
-      <w:pPr>
-        <w:spacing w:after="0" w:line="240" w:lineRule="auto"/>
-        <w:rPr>
-          <w:rFonts w:ascii="Times New Roman" w:hAnsi="Times New Roman" w:eastAsia="Times New Roman"/>
-          <w:color w:val="0E0E0E"/>
-          <w:sz w:val="16"/>
-          <w:szCs w:val="16"/>
-          <w:lang w:eastAsia="pl-PL"/>
-        </w:rPr>
-      </w:pPr>
-    </w:p>
-    <w:p>
-      <w:pPr>
-        <w:spacing w:after="0" w:line="240" w:lineRule="auto"/>
-        <w:jc w:val="right"/>
-        <w:rPr>
-          <w:rFonts w:ascii="Times New Roman" w:hAnsi="Times New Roman" w:eastAsia="Times New Roman"/>
-          <w:color w:val="0E0E0E"/>
-          <w:sz w:val="20"/>
-          <w:szCs w:val="20"/>
-          <w:lang w:eastAsia="pl-PL"/>
-        </w:rPr>
-      </w:pPr>
-      <w:r>
-        <w:rPr>
-          <w:rFonts w:ascii="Times New Roman" w:hAnsi="Times New Roman" w:eastAsia="Times New Roman"/>
-          <w:color w:val="0E0E0E"/>
-          <w:sz w:val="20"/>
-          <w:szCs w:val="20"/>
-          <w:lang w:eastAsia="pl-PL"/>
-        </w:rPr>
-        <w:t xml:space="preserve"> {{data_wystawienia}}                         </w:t>
-      </w:r>
-      <w:r>
-        <w:tab/>
-      </w:r>
-      <w:r>
-        <w:tab/>
-      </w:r>
-      <w:r>
-        <w:rPr>
-          <w:rFonts w:ascii="Times New Roman" w:hAnsi="Times New Roman" w:eastAsia="Times New Roman"/>
-          <w:color w:val="0E0E0E"/>
-          <w:sz w:val="20"/>
-          <w:szCs w:val="20"/>
-          <w:lang w:eastAsia="pl-PL"/>
-        </w:rPr>
-        <w:t>…..………………..</w:t>
-      </w:r>
-    </w:p>
-    <w:p>
-      <w:pPr>
-        <w:spacing w:after="0" w:line="240" w:lineRule="auto"/>
-        <w:ind w:left="1416"/>
-        <w:jc w:val="center"/>
-        <w:rPr>
-          <w:rFonts w:ascii="Times New Roman" w:hAnsi="Times New Roman" w:eastAsia="Times New Roman"/>
-          <w:color w:val="0E0E0E"/>
-          <w:sz w:val="16"/>
-          <w:szCs w:val="16"/>
-          <w:lang w:eastAsia="pl-PL"/>
-        </w:rPr>
-      </w:pPr>
-      <w:r>
-        <w:rPr>
-          <w:rFonts w:ascii="Times New Roman" w:hAnsi="Times New Roman" w:eastAsia="Times New Roman"/>
-          <w:color w:val="0E0E0E"/>
-          <w:sz w:val="16"/>
-          <w:szCs w:val="16"/>
-          <w:lang w:eastAsia="pl-PL"/>
-        </w:rPr>
-        <w:t xml:space="preserve">    (data)</w:t>
-      </w:r>
-      <w:r>
-        <w:tab/>
-      </w:r>
-      <w:r>
-        <w:tab/>
-      </w:r>
-      <w:r>
-        <w:tab/>
-      </w:r>
-      <w:r>
-        <w:tab/>
-      </w:r>
-      <w:r>
-        <w:rPr>
-          <w:rFonts w:ascii="Times New Roman" w:hAnsi="Times New Roman" w:eastAsia="Times New Roman"/>
-          <w:color w:val="0E0E0E"/>
-          <w:sz w:val="16"/>
-          <w:szCs w:val="16"/>
-          <w:lang w:eastAsia="pl-PL"/>
-        </w:rPr>
-        <w:t xml:space="preserve">                                   (podpis)</w:t>
-      </w:r>
-    </w:p>
-    <w:p>
-      <w:pPr>
-        <w:spacing w:after="0" w:line="240" w:lineRule="auto"/>
-        <w:rPr>
-          <w:rFonts w:ascii="Arial" w:hAnsi="Arial" w:eastAsia="Times New Roman" w:cs="Arial"/>
-          <w:sz w:val="16"/>
-          <w:szCs w:val="16"/>
-          <w:lang w:val="en-US" w:eastAsia="pl-PL"/>
-        </w:rPr>
-      </w:pPr>
-      <w:r>
-        <w:br/>
-      </w:r>
-      <w:r>
-        <w:rPr>
-          <w:rFonts w:ascii="Arial" w:hAnsi="Arial" w:eastAsia="Times New Roman" w:cs="Arial"/>
-          <w:sz w:val="16"/>
-          <w:szCs w:val="16"/>
-          <w:lang w:val="en-US" w:eastAsia="pl-PL"/>
-        </w:rPr>
-        <w:br w:type="column"/>
-      </w:r>
-    </w:p>
-    <w:p>
-      <w:pPr>
-        <w:spacing w:after="0" w:line="240" w:lineRule="auto"/>
-        <w:rPr>
-          <w:rFonts w:ascii="Arial" w:hAnsi="Arial" w:eastAsia="Times New Roman" w:cs="Arial"/>
-          <w:sz w:val="16"/>
-          <w:szCs w:val="16"/>
-          <w:lang w:val="en-US" w:eastAsia="pl-PL"/>
-        </w:rPr>
-      </w:pPr>
-    </w:p>
-    <w:sectPr>
-      <w:pgSz w:w="16838" w:h="11906" w:orient="landscape"/>
-      <w:pgMar w:top="720" w:right="720" w:bottom="720" w:left="720" w:header="709" w:footer="709" w:gutter="0"/>
-      <w:cols w:space="708" w:num="2"/>
-      <w:docGrid w:linePitch="360"/>
-    </w:sectPr>
   </w:body>
 </w:document>
 </file>

</xml_diff>